<commit_message>
Update 2 years experience
</commit_message>
<xml_diff>
--- a/cv/CV.en.docx
+++ b/cv/CV.en.docx
@@ -179,23 +179,55 @@
           <w:sz w:val="24"/>
           <w:szCs w:val="24"/>
         </w:rPr>
-        <w:t xml:space="preserve">more </w:t>
-      </w:r>
-      <w:r>
-        <w:rPr>
-          <w:rFonts w:ascii="Calibri" w:hAnsi="Calibri" w:cs="Calibri"/>
-          <w:sz w:val="24"/>
-          <w:szCs w:val="24"/>
-        </w:rPr>
-        <w:t xml:space="preserve">1 </w:t>
-      </w:r>
-      <w:r>
-        <w:rPr>
-          <w:rFonts w:ascii="Calibri" w:hAnsi="Calibri" w:cs="Calibri"/>
-          <w:sz w:val="24"/>
-          <w:szCs w:val="24"/>
-        </w:rPr>
-        <w:t>year of hands-on experience in Software E</w:t>
+        <w:t>nearly</w:t>
+      </w:r>
+      <w:r>
+        <w:rPr>
+          <w:rFonts w:ascii="Calibri" w:hAnsi="Calibri" w:cs="Calibri"/>
+          <w:sz w:val="24"/>
+          <w:szCs w:val="24"/>
+        </w:rPr>
+        <w:t xml:space="preserve"> </w:t>
+      </w:r>
+      <w:r>
+        <w:rPr>
+          <w:rFonts w:ascii="Calibri" w:hAnsi="Calibri" w:cs="Calibri"/>
+          <w:sz w:val="24"/>
+          <w:szCs w:val="24"/>
+        </w:rPr>
+        <w:t>2</w:t>
+      </w:r>
+      <w:r>
+        <w:rPr>
+          <w:rFonts w:ascii="Calibri" w:hAnsi="Calibri" w:cs="Calibri"/>
+          <w:sz w:val="24"/>
+          <w:szCs w:val="24"/>
+        </w:rPr>
+        <w:t xml:space="preserve"> </w:t>
+      </w:r>
+      <w:r>
+        <w:rPr>
+          <w:rFonts w:ascii="Calibri" w:hAnsi="Calibri" w:cs="Calibri"/>
+          <w:sz w:val="24"/>
+          <w:szCs w:val="24"/>
+        </w:rPr>
+        <w:t>year</w:t>
+      </w:r>
+      <w:r>
+        <w:rPr>
+          <w:rFonts w:ascii="Calibri" w:hAnsi="Calibri" w:cs="Calibri"/>
+          <w:sz w:val="24"/>
+          <w:szCs w:val="24"/>
+        </w:rPr>
+        <w:t>s</w:t>
+      </w:r>
+      <w:r>
+        <w:rPr>
+          <w:rFonts w:ascii="Calibri" w:hAnsi="Calibri" w:cs="Calibri"/>
+          <w:sz w:val="24"/>
+          <w:szCs w:val="24"/>
+        </w:rPr>
+        <w:t xml:space="preserve"> of hands-on experience in Software E</w:t>
       </w:r>
       <w:r>
         <w:rPr>
@@ -251,36 +283,492 @@
           <w:sz w:val="24"/>
           <w:szCs w:val="24"/>
         </w:rPr>
-        <w:t xml:space="preserve">Programming Languages: </w:t>
-      </w:r>
-      <w:r>
-        <w:rPr>
-          <w:rFonts w:ascii="Calibri" w:hAnsi="Calibri" w:cs="Calibri"/>
-          <w:bCs/>
-          <w:sz w:val="24"/>
-          <w:szCs w:val="24"/>
-        </w:rPr>
-        <w:t>Java, JavaScript &amp; TypeScript</w:t>
-      </w:r>
-    </w:p>
-    <w:p>
-      <w:pPr>
-        <w:spacing w:line="240" w:lineRule="auto"/>
-        <w:rPr>
-          <w:rFonts w:ascii="Calibri" w:hAnsi="Calibri" w:cs="Calibri"/>
-          <w:b/>
-          <w:sz w:val="24"/>
-          <w:szCs w:val="24"/>
-        </w:rPr>
-      </w:pPr>
-      <w:r>
-        <w:rPr>
-          <w:rFonts w:ascii="Calibri" w:hAnsi="Calibri" w:cs="Calibri"/>
-          <w:b/>
-          <w:sz w:val="24"/>
-          <w:szCs w:val="24"/>
-        </w:rPr>
-        <w:t>Frameworks/Platforms:</w:t>
+        <w:t>Backend</w:t>
+      </w:r>
+      <w:r>
+        <w:rPr>
+          <w:rFonts w:ascii="Calibri" w:hAnsi="Calibri" w:cs="Calibri"/>
+          <w:b/>
+          <w:sz w:val="24"/>
+          <w:szCs w:val="24"/>
+        </w:rPr>
+        <w:t xml:space="preserve"> &amp; Microservices</w:t>
+      </w:r>
+      <w:r>
+        <w:rPr>
+          <w:rFonts w:ascii="Calibri" w:hAnsi="Calibri" w:cs="Calibri"/>
+          <w:b/>
+          <w:sz w:val="24"/>
+          <w:szCs w:val="24"/>
+        </w:rPr>
+        <w:t>:</w:t>
+      </w:r>
+      <w:r>
+        <w:rPr>
+          <w:rFonts w:ascii="Calibri" w:hAnsi="Calibri" w:cs="Calibri"/>
+          <w:b/>
+          <w:sz w:val="24"/>
+          <w:szCs w:val="24"/>
+        </w:rPr>
+        <w:t xml:space="preserve"> </w:t>
+      </w:r>
+      <w:r>
+        <w:rPr>
+          <w:rFonts w:ascii="Calibri" w:hAnsi="Calibri" w:cs="Calibri"/>
+          <w:bCs/>
+          <w:sz w:val="24"/>
+          <w:szCs w:val="24"/>
+        </w:rPr>
+        <w:t xml:space="preserve">Java 17, Spring Boot, </w:t>
+      </w:r>
+      <w:r>
+        <w:rPr>
+          <w:rFonts w:ascii="Calibri" w:hAnsi="Calibri" w:cs="Calibri"/>
+          <w:bCs/>
+          <w:sz w:val="24"/>
+          <w:szCs w:val="24"/>
+        </w:rPr>
+        <w:t xml:space="preserve">Spring Cloud (API Gateway, Service Discovery, Config Server), </w:t>
+      </w:r>
+      <w:r>
+        <w:rPr>
+          <w:rFonts w:ascii="Calibri" w:hAnsi="Calibri" w:cs="Calibri"/>
+          <w:bCs/>
+          <w:sz w:val="24"/>
+          <w:szCs w:val="24"/>
+        </w:rPr>
+        <w:t xml:space="preserve">Spring Security (JWT/OAuth2), Spring Data JPA, </w:t>
+      </w:r>
+      <w:proofErr w:type="spellStart"/>
+      <w:r>
+        <w:rPr>
+          <w:rFonts w:ascii="Calibri" w:hAnsi="Calibri" w:cs="Calibri"/>
+          <w:bCs/>
+          <w:sz w:val="24"/>
+          <w:szCs w:val="24"/>
+        </w:rPr>
+        <w:t>MyBatis</w:t>
+      </w:r>
+      <w:proofErr w:type="spellEnd"/>
+    </w:p>
+    <w:p>
+      <w:pPr>
+        <w:spacing w:line="240" w:lineRule="auto"/>
+        <w:rPr>
+          <w:rFonts w:ascii="Calibri" w:hAnsi="Calibri" w:cs="Calibri"/>
+          <w:bCs/>
+          <w:sz w:val="24"/>
+          <w:szCs w:val="24"/>
+        </w:rPr>
+      </w:pPr>
+      <w:r>
+        <w:rPr>
+          <w:rFonts w:ascii="Calibri" w:hAnsi="Calibri" w:cs="Calibri"/>
+          <w:b/>
+          <w:sz w:val="24"/>
+          <w:szCs w:val="24"/>
+        </w:rPr>
+        <w:t>Event-Driven &amp; Messaging</w:t>
+      </w:r>
+      <w:r>
+        <w:rPr>
+          <w:rFonts w:ascii="Calibri" w:hAnsi="Calibri" w:cs="Calibri"/>
+          <w:bCs/>
+          <w:sz w:val="24"/>
+          <w:szCs w:val="24"/>
+        </w:rPr>
+        <w:t>: Spring Cloud Stream,</w:t>
+      </w:r>
+      <w:r>
+        <w:rPr>
+          <w:rFonts w:ascii="Calibri" w:hAnsi="Calibri" w:cs="Calibri"/>
+          <w:bCs/>
+          <w:sz w:val="24"/>
+          <w:szCs w:val="24"/>
+        </w:rPr>
+        <w:t xml:space="preserve"> Message Broker</w:t>
+      </w:r>
+      <w:r>
+        <w:rPr>
+          <w:rFonts w:ascii="Calibri" w:hAnsi="Calibri" w:cs="Calibri"/>
+          <w:bCs/>
+          <w:sz w:val="24"/>
+          <w:szCs w:val="24"/>
+        </w:rPr>
+        <w:t xml:space="preserve"> (RabbitMQ, Kafka)</w:t>
+      </w:r>
+      <w:r>
+        <w:rPr>
+          <w:rFonts w:ascii="Calibri" w:hAnsi="Calibri" w:cs="Calibri"/>
+          <w:bCs/>
+          <w:sz w:val="24"/>
+          <w:szCs w:val="24"/>
+        </w:rPr>
+        <w:t>, WebSocket</w:t>
+      </w:r>
+    </w:p>
+    <w:p>
+      <w:pPr>
+        <w:spacing w:line="240" w:lineRule="auto"/>
+        <w:rPr>
+          <w:rFonts w:ascii="Calibri" w:hAnsi="Calibri" w:cs="Calibri"/>
+          <w:bCs/>
+          <w:sz w:val="24"/>
+          <w:szCs w:val="24"/>
+        </w:rPr>
+      </w:pPr>
+      <w:r>
+        <w:rPr>
+          <w:rFonts w:ascii="Calibri" w:hAnsi="Calibri" w:cs="Calibri"/>
+          <w:b/>
+          <w:sz w:val="24"/>
+          <w:szCs w:val="24"/>
+        </w:rPr>
+        <w:t>Performance</w:t>
+      </w:r>
+      <w:r>
+        <w:rPr>
+          <w:rFonts w:ascii="Calibri" w:hAnsi="Calibri" w:cs="Calibri"/>
+          <w:bCs/>
+          <w:sz w:val="24"/>
+          <w:szCs w:val="24"/>
+        </w:rPr>
+        <w:t xml:space="preserve">: </w:t>
+      </w:r>
+      <w:r>
+        <w:rPr>
+          <w:rFonts w:ascii="Calibri" w:hAnsi="Calibri" w:cs="Calibri"/>
+          <w:bCs/>
+          <w:sz w:val="24"/>
+          <w:szCs w:val="24"/>
+        </w:rPr>
+        <w:t>Transaction Management</w:t>
+      </w:r>
+      <w:r>
+        <w:rPr>
+          <w:rFonts w:ascii="Calibri" w:hAnsi="Calibri" w:cs="Calibri"/>
+          <w:bCs/>
+          <w:sz w:val="24"/>
+          <w:szCs w:val="24"/>
+        </w:rPr>
+        <w:t xml:space="preserve">, </w:t>
+      </w:r>
+      <w:proofErr w:type="spellStart"/>
+      <w:r>
+        <w:rPr>
+          <w:rFonts w:ascii="Calibri" w:hAnsi="Calibri" w:cs="Calibri"/>
+          <w:bCs/>
+          <w:sz w:val="24"/>
+          <w:szCs w:val="24"/>
+        </w:rPr>
+        <w:t>Ehcache</w:t>
+      </w:r>
+      <w:proofErr w:type="spellEnd"/>
+      <w:r>
+        <w:rPr>
+          <w:rFonts w:ascii="Calibri" w:hAnsi="Calibri" w:cs="Calibri"/>
+          <w:bCs/>
+          <w:sz w:val="24"/>
+          <w:szCs w:val="24"/>
+        </w:rPr>
+        <w:t>,</w:t>
+      </w:r>
+      <w:r>
+        <w:rPr>
+          <w:rFonts w:ascii="Calibri" w:hAnsi="Calibri" w:cs="Calibri"/>
+          <w:bCs/>
+          <w:sz w:val="24"/>
+          <w:szCs w:val="24"/>
+        </w:rPr>
+        <w:t xml:space="preserve"> Spring Batch,</w:t>
+      </w:r>
+      <w:r>
+        <w:rPr>
+          <w:rFonts w:ascii="Calibri" w:hAnsi="Calibri" w:cs="Calibri"/>
+          <w:bCs/>
+          <w:sz w:val="24"/>
+          <w:szCs w:val="24"/>
+        </w:rPr>
+        <w:t xml:space="preserve"> Redis</w:t>
+      </w:r>
+    </w:p>
+    <w:p>
+      <w:pPr>
+        <w:spacing w:line="240" w:lineRule="auto"/>
+        <w:rPr>
+          <w:rFonts w:ascii="Calibri" w:hAnsi="Calibri" w:cs="Calibri"/>
+          <w:bCs/>
+          <w:sz w:val="24"/>
+          <w:szCs w:val="24"/>
+        </w:rPr>
+      </w:pPr>
+      <w:r>
+        <w:rPr>
+          <w:rFonts w:ascii="Calibri" w:hAnsi="Calibri" w:cs="Calibri"/>
+          <w:b/>
+          <w:sz w:val="24"/>
+          <w:szCs w:val="24"/>
+        </w:rPr>
+        <w:t>Frontend:</w:t>
+      </w:r>
+      <w:r>
+        <w:rPr>
+          <w:rFonts w:ascii="Calibri" w:hAnsi="Calibri" w:cs="Calibri"/>
+          <w:bCs/>
+          <w:sz w:val="24"/>
+          <w:szCs w:val="24"/>
+        </w:rPr>
+        <w:t xml:space="preserve"> ReactJS, </w:t>
+      </w:r>
+      <w:r>
+        <w:rPr>
+          <w:rFonts w:ascii="Calibri" w:hAnsi="Calibri" w:cs="Calibri"/>
+          <w:bCs/>
+          <w:sz w:val="24"/>
+          <w:szCs w:val="24"/>
+        </w:rPr>
+        <w:t>Next.js,</w:t>
+      </w:r>
+      <w:r>
+        <w:rPr>
+          <w:rFonts w:ascii="Calibri" w:hAnsi="Calibri" w:cs="Calibri"/>
+          <w:bCs/>
+          <w:sz w:val="24"/>
+          <w:szCs w:val="24"/>
+        </w:rPr>
+        <w:t xml:space="preserve"> </w:t>
+      </w:r>
+      <w:r>
+        <w:rPr>
+          <w:rFonts w:ascii="Calibri" w:hAnsi="Calibri" w:cs="Calibri"/>
+          <w:bCs/>
+          <w:sz w:val="24"/>
+          <w:szCs w:val="24"/>
+        </w:rPr>
+        <w:t xml:space="preserve">TypeScript, Material UI, Tailwind CSS, </w:t>
+      </w:r>
+      <w:proofErr w:type="spellStart"/>
+      <w:r>
+        <w:rPr>
+          <w:rFonts w:ascii="Calibri" w:hAnsi="Calibri" w:cs="Calibri"/>
+          <w:bCs/>
+          <w:sz w:val="24"/>
+          <w:szCs w:val="24"/>
+        </w:rPr>
+        <w:t>TanStack</w:t>
+      </w:r>
+      <w:proofErr w:type="spellEnd"/>
+      <w:r>
+        <w:rPr>
+          <w:rFonts w:ascii="Calibri" w:hAnsi="Calibri" w:cs="Calibri"/>
+          <w:bCs/>
+          <w:sz w:val="24"/>
+          <w:szCs w:val="24"/>
+        </w:rPr>
+        <w:t xml:space="preserve"> Query, </w:t>
+      </w:r>
+      <w:proofErr w:type="spellStart"/>
+      <w:r>
+        <w:rPr>
+          <w:rFonts w:ascii="Calibri" w:hAnsi="Calibri" w:cs="Calibri"/>
+          <w:bCs/>
+          <w:sz w:val="24"/>
+          <w:szCs w:val="24"/>
+        </w:rPr>
+        <w:t>Zustand</w:t>
+      </w:r>
+      <w:proofErr w:type="spellEnd"/>
+      <w:r>
+        <w:rPr>
+          <w:rFonts w:ascii="Calibri" w:hAnsi="Calibri" w:cs="Calibri"/>
+          <w:bCs/>
+          <w:sz w:val="24"/>
+          <w:szCs w:val="24"/>
+        </w:rPr>
+        <w:t>,</w:t>
+      </w:r>
+      <w:r>
+        <w:rPr>
+          <w:rFonts w:ascii="Calibri" w:hAnsi="Calibri" w:cs="Calibri"/>
+          <w:bCs/>
+          <w:sz w:val="24"/>
+          <w:szCs w:val="24"/>
+        </w:rPr>
+        <w:t xml:space="preserve"> Context API,</w:t>
+      </w:r>
+      <w:r>
+        <w:rPr>
+          <w:rFonts w:ascii="Calibri" w:hAnsi="Calibri" w:cs="Calibri"/>
+          <w:bCs/>
+          <w:sz w:val="24"/>
+          <w:szCs w:val="24"/>
+        </w:rPr>
+        <w:t xml:space="preserve"> AG Grid</w:t>
+      </w:r>
+    </w:p>
+    <w:p>
+      <w:pPr>
+        <w:spacing w:line="240" w:lineRule="auto"/>
+        <w:rPr>
+          <w:rFonts w:ascii="Calibri" w:hAnsi="Calibri" w:cs="Calibri"/>
+          <w:sz w:val="24"/>
+          <w:szCs w:val="24"/>
+        </w:rPr>
+      </w:pPr>
+      <w:r>
+        <w:rPr>
+          <w:rFonts w:ascii="Calibri" w:hAnsi="Calibri" w:cs="Calibri"/>
+          <w:b/>
+          <w:sz w:val="24"/>
+          <w:szCs w:val="24"/>
+        </w:rPr>
+        <w:t>Database</w:t>
+      </w:r>
+      <w:r>
+        <w:rPr>
+          <w:rFonts w:ascii="Calibri" w:hAnsi="Calibri" w:cs="Calibri"/>
+          <w:sz w:val="24"/>
+          <w:szCs w:val="24"/>
+        </w:rPr>
+        <w:t xml:space="preserve">: </w:t>
+      </w:r>
+      <w:r>
+        <w:rPr>
+          <w:rFonts w:ascii="Calibri" w:hAnsi="Calibri" w:cs="Calibri"/>
+          <w:sz w:val="24"/>
+          <w:szCs w:val="24"/>
+        </w:rPr>
+        <w:t>Oracle DB, PostgreSQL, MySQL, Flyway</w:t>
+      </w:r>
+      <w:r>
+        <w:rPr>
+          <w:rFonts w:ascii="Calibri" w:hAnsi="Calibri" w:cs="Calibri"/>
+          <w:sz w:val="24"/>
+          <w:szCs w:val="24"/>
+        </w:rPr>
+        <w:t>, Query Optimization</w:t>
+      </w:r>
+    </w:p>
+    <w:p>
+      <w:pPr>
+        <w:spacing w:line="240" w:lineRule="auto"/>
+        <w:rPr>
+          <w:rFonts w:ascii="Calibri" w:hAnsi="Calibri" w:cs="Calibri"/>
+          <w:sz w:val="24"/>
+          <w:szCs w:val="24"/>
+        </w:rPr>
+      </w:pPr>
+      <w:r>
+        <w:rPr>
+          <w:rFonts w:ascii="Calibri" w:hAnsi="Calibri" w:cs="Calibri"/>
+          <w:b/>
+          <w:bCs/>
+          <w:sz w:val="24"/>
+          <w:szCs w:val="24"/>
+        </w:rPr>
+        <w:t xml:space="preserve">DevOps: </w:t>
+      </w:r>
+      <w:r>
+        <w:rPr>
+          <w:rFonts w:ascii="Calibri" w:hAnsi="Calibri" w:cs="Calibri"/>
+          <w:sz w:val="24"/>
+          <w:szCs w:val="24"/>
+        </w:rPr>
+        <w:t xml:space="preserve">Docker, </w:t>
+      </w:r>
+      <w:r>
+        <w:rPr>
+          <w:rFonts w:ascii="Calibri" w:hAnsi="Calibri" w:cs="Calibri"/>
+          <w:sz w:val="24"/>
+          <w:szCs w:val="24"/>
+        </w:rPr>
+        <w:t>Jenkins CI/CD</w:t>
+      </w:r>
+      <w:r>
+        <w:rPr>
+          <w:rFonts w:ascii="Calibri" w:hAnsi="Calibri" w:cs="Calibri"/>
+          <w:sz w:val="24"/>
+          <w:szCs w:val="24"/>
+        </w:rPr>
+        <w:t xml:space="preserve">, </w:t>
+      </w:r>
+      <w:r>
+        <w:rPr>
+          <w:rFonts w:ascii="Calibri" w:hAnsi="Calibri" w:cs="Calibri"/>
+          <w:sz w:val="24"/>
+          <w:szCs w:val="24"/>
+        </w:rPr>
+        <w:t xml:space="preserve">Linux </w:t>
+      </w:r>
+      <w:r>
+        <w:rPr>
+          <w:rFonts w:ascii="Calibri" w:hAnsi="Calibri" w:cs="Calibri"/>
+          <w:sz w:val="24"/>
+          <w:szCs w:val="24"/>
+        </w:rPr>
+        <w:t>VPS,</w:t>
+      </w:r>
+      <w:r>
+        <w:rPr>
+          <w:rFonts w:ascii="Calibri" w:hAnsi="Calibri" w:cs="Calibri"/>
+          <w:sz w:val="24"/>
+          <w:szCs w:val="24"/>
+        </w:rPr>
+        <w:t xml:space="preserve"> AWS Services (EC2, S3, RDS, IAM),</w:t>
+      </w:r>
+      <w:r>
+        <w:rPr>
+          <w:rFonts w:ascii="Calibri" w:hAnsi="Calibri" w:cs="Calibri"/>
+          <w:sz w:val="24"/>
+          <w:szCs w:val="24"/>
+        </w:rPr>
+        <w:t xml:space="preserve"> Maven</w:t>
+      </w:r>
+      <w:r>
+        <w:rPr>
+          <w:rFonts w:ascii="Calibri" w:hAnsi="Calibri" w:cs="Calibri"/>
+          <w:sz w:val="24"/>
+          <w:szCs w:val="24"/>
+        </w:rPr>
+        <w:t>/</w:t>
+      </w:r>
+      <w:r>
+        <w:rPr>
+          <w:rFonts w:ascii="Calibri" w:hAnsi="Calibri" w:cs="Calibri"/>
+          <w:sz w:val="24"/>
+          <w:szCs w:val="24"/>
+        </w:rPr>
+        <w:t>Gradle, Git/GitHub</w:t>
+      </w:r>
+      <w:r>
+        <w:rPr>
+          <w:rFonts w:ascii="Calibri" w:hAnsi="Calibri" w:cs="Calibri"/>
+          <w:sz w:val="24"/>
+          <w:szCs w:val="24"/>
+        </w:rPr>
+        <w:t>, Zabbix, SonarQube</w:t>
+      </w:r>
+    </w:p>
+    <w:p>
+      <w:pPr>
+        <w:spacing w:line="240" w:lineRule="auto"/>
+        <w:rPr>
+          <w:rFonts w:ascii="Calibri" w:hAnsi="Calibri" w:cs="Calibri"/>
+          <w:b/>
+          <w:bCs/>
+          <w:sz w:val="24"/>
+          <w:szCs w:val="24"/>
+        </w:rPr>
+      </w:pPr>
+      <w:r>
+        <w:rPr>
+          <w:rFonts w:ascii="Calibri" w:hAnsi="Calibri" w:cs="Calibri"/>
+          <w:b/>
+          <w:bCs/>
+          <w:sz w:val="24"/>
+          <w:szCs w:val="24"/>
+        </w:rPr>
+        <w:t>Others:</w:t>
       </w:r>
     </w:p>
     <w:p>
@@ -305,19 +793,8 @@
           <w:sz w:val="24"/>
           <w:szCs w:val="24"/>
         </w:rPr>
-        <w:t xml:space="preserve">Spring Boot, Spring Security (JWT/OAuth2), Spring Data JPA, </w:t>
-      </w:r>
-      <w:proofErr w:type="spellStart"/>
-      <w:r>
-        <w:rPr>
-          <w:rFonts w:ascii="Calibri" w:hAnsi="Calibri" w:cs="Calibri"/>
-          <w:bCs/>
-          <w:sz w:val="24"/>
-          <w:szCs w:val="24"/>
-        </w:rPr>
-        <w:t>MyBatis</w:t>
-      </w:r>
-      <w:proofErr w:type="spellEnd"/>
+        <w:t>Good understanding of OOP methodologies, SOLID principles, and design patterns</w:t>
+      </w:r>
     </w:p>
     <w:p>
       <w:pPr>
@@ -341,7 +818,7 @@
           <w:sz w:val="24"/>
           <w:szCs w:val="24"/>
         </w:rPr>
-        <w:t>RESTful API Design, Transaction Management, Message Broker, WebSocket</w:t>
+        <w:t>Experience in Unit &amp; Integration Testing (JUnit 5, Mockito)</w:t>
       </w:r>
     </w:p>
     <w:p>
@@ -366,100 +843,192 @@
           <w:sz w:val="24"/>
           <w:szCs w:val="24"/>
         </w:rPr>
-        <w:t>ReactJS, Material UI, Tailwind CSS</w:t>
-      </w:r>
-    </w:p>
-    <w:p>
-      <w:pPr>
-        <w:spacing w:line="240" w:lineRule="auto"/>
-        <w:rPr>
-          <w:rFonts w:ascii="Calibri" w:hAnsi="Calibri" w:cs="Calibri"/>
-          <w:sz w:val="24"/>
-          <w:szCs w:val="24"/>
-        </w:rPr>
-      </w:pPr>
-      <w:r>
-        <w:rPr>
-          <w:rFonts w:ascii="Calibri" w:hAnsi="Calibri" w:cs="Calibri"/>
-          <w:b/>
-          <w:sz w:val="24"/>
-          <w:szCs w:val="24"/>
-        </w:rPr>
-        <w:t>Database Management</w:t>
-      </w:r>
-      <w:r>
-        <w:rPr>
-          <w:rFonts w:ascii="Calibri" w:hAnsi="Calibri" w:cs="Calibri"/>
-          <w:sz w:val="24"/>
-          <w:szCs w:val="24"/>
-        </w:rPr>
-        <w:t xml:space="preserve">: </w:t>
-      </w:r>
-      <w:r>
-        <w:rPr>
-          <w:rFonts w:ascii="Calibri" w:hAnsi="Calibri" w:cs="Calibri"/>
-          <w:sz w:val="24"/>
-          <w:szCs w:val="24"/>
-        </w:rPr>
-        <w:t>PostgreSQL, MySQL, Oracle DB</w:t>
-      </w:r>
-      <w:r>
-        <w:rPr>
-          <w:rFonts w:ascii="Calibri" w:hAnsi="Calibri" w:cs="Calibri"/>
-          <w:sz w:val="24"/>
-          <w:szCs w:val="24"/>
-        </w:rPr>
-        <w:t>, Redis, Flyway</w:t>
-      </w:r>
-    </w:p>
-    <w:p>
-      <w:pPr>
-        <w:spacing w:line="240" w:lineRule="auto"/>
-        <w:rPr>
-          <w:rFonts w:ascii="Calibri" w:hAnsi="Calibri" w:cs="Calibri"/>
-          <w:sz w:val="24"/>
-          <w:szCs w:val="24"/>
-        </w:rPr>
-      </w:pPr>
-      <w:r>
-        <w:rPr>
-          <w:rFonts w:ascii="Calibri" w:hAnsi="Calibri" w:cs="Calibri"/>
-          <w:b/>
-          <w:bCs/>
-          <w:sz w:val="24"/>
-          <w:szCs w:val="24"/>
-        </w:rPr>
-        <w:t xml:space="preserve">DevOps: </w:t>
-      </w:r>
-      <w:r>
-        <w:rPr>
-          <w:rFonts w:ascii="Calibri" w:hAnsi="Calibri" w:cs="Calibri"/>
-          <w:sz w:val="24"/>
-          <w:szCs w:val="24"/>
-        </w:rPr>
-        <w:t>Docker, CI/CD, Linux VPS, Maven, Gradle, Git/GitHub</w:t>
-      </w:r>
-    </w:p>
-    <w:p>
-      <w:pPr>
-        <w:spacing w:line="240" w:lineRule="auto"/>
-        <w:rPr>
-          <w:rFonts w:ascii="Calibri" w:hAnsi="Calibri" w:cs="Calibri"/>
-          <w:b/>
-          <w:bCs/>
-          <w:sz w:val="24"/>
-          <w:szCs w:val="24"/>
-        </w:rPr>
-      </w:pPr>
-      <w:r>
-        <w:rPr>
-          <w:rFonts w:ascii="Calibri" w:hAnsi="Calibri" w:cs="Calibri"/>
-          <w:b/>
-          <w:bCs/>
-          <w:sz w:val="24"/>
-          <w:szCs w:val="24"/>
-        </w:rPr>
-        <w:t>Others:</w:t>
+        <w:t>Agile/Scrum mindset</w:t>
+      </w:r>
+    </w:p>
+    <w:p>
+      <w:pPr>
+        <w:spacing w:line="240" w:lineRule="auto"/>
+        <w:rPr>
+          <w:rFonts w:ascii="Calibri" w:hAnsi="Calibri" w:cs="Calibri"/>
+          <w:b/>
+          <w:sz w:val="30"/>
+          <w:szCs w:val="30"/>
+        </w:rPr>
+      </w:pPr>
+      <w:r>
+        <w:rPr>
+          <w:rFonts w:ascii="Calibri" w:hAnsi="Calibri" w:cs="Calibri"/>
+          <w:b/>
+          <w:sz w:val="30"/>
+          <w:szCs w:val="30"/>
+        </w:rPr>
+        <w:t>PROFESSIONAL EXPERIENCE</w:t>
+      </w:r>
+    </w:p>
+    <w:p>
+      <w:pPr>
+        <w:spacing w:line="240" w:lineRule="auto"/>
+        <w:rPr>
+          <w:rFonts w:ascii="Calibri" w:hAnsi="Calibri" w:cs="Calibri"/>
+          <w:sz w:val="24"/>
+          <w:szCs w:val="24"/>
+        </w:rPr>
+      </w:pPr>
+      <w:r>
+        <w:rPr>
+          <w:rFonts w:ascii="Calibri" w:hAnsi="Calibri" w:cs="Calibri"/>
+          <w:b/>
+          <w:sz w:val="24"/>
+          <w:szCs w:val="24"/>
+        </w:rPr>
+        <w:t>LG CNS Company (Vietnam)</w:t>
+      </w:r>
+      <w:r>
+        <w:rPr>
+          <w:rFonts w:ascii="Calibri" w:hAnsi="Calibri" w:cs="Calibri"/>
+          <w:b/>
+          <w:sz w:val="24"/>
+          <w:szCs w:val="24"/>
+        </w:rPr>
+        <w:t xml:space="preserve"> – Full Stack Developer</w:t>
+      </w:r>
+      <w:r>
+        <w:rPr>
+          <w:rFonts w:ascii="Calibri" w:hAnsi="Calibri" w:cs="Calibri"/>
+          <w:b/>
+          <w:sz w:val="24"/>
+          <w:szCs w:val="24"/>
+        </w:rPr>
+        <w:t xml:space="preserve">       </w:t>
+      </w:r>
+      <w:r>
+        <w:rPr>
+          <w:rFonts w:ascii="Calibri" w:hAnsi="Calibri" w:cs="Calibri"/>
+          <w:sz w:val="24"/>
+          <w:szCs w:val="24"/>
+        </w:rPr>
+        <w:t xml:space="preserve">    </w:t>
+      </w:r>
+      <w:r>
+        <w:rPr>
+          <w:rFonts w:ascii="Calibri" w:hAnsi="Calibri" w:cs="Calibri"/>
+          <w:sz w:val="24"/>
+          <w:szCs w:val="24"/>
+        </w:rPr>
+        <w:tab/>
+        <w:t xml:space="preserve">                   </w:t>
+      </w:r>
+      <w:r>
+        <w:rPr>
+          <w:rFonts w:ascii="Calibri" w:hAnsi="Calibri" w:cs="Calibri"/>
+          <w:sz w:val="24"/>
+          <w:szCs w:val="24"/>
+        </w:rPr>
+        <w:t xml:space="preserve">          </w:t>
+      </w:r>
+      <w:r>
+        <w:rPr>
+          <w:rFonts w:ascii="Calibri" w:hAnsi="Calibri" w:cs="Calibri"/>
+          <w:sz w:val="24"/>
+          <w:szCs w:val="24"/>
+        </w:rPr>
+        <w:t xml:space="preserve">     </w:t>
+      </w:r>
+      <w:r>
+        <w:rPr>
+          <w:rFonts w:ascii="Calibri" w:hAnsi="Calibri" w:cs="Calibri"/>
+          <w:b/>
+          <w:sz w:val="24"/>
+          <w:szCs w:val="24"/>
+        </w:rPr>
+        <w:t>02/2025-Now</w:t>
+      </w:r>
+      <w:r>
+        <w:rPr>
+          <w:rFonts w:ascii="Calibri" w:hAnsi="Calibri" w:cs="Calibri"/>
+          <w:b/>
+          <w:sz w:val="24"/>
+          <w:szCs w:val="24"/>
+        </w:rPr>
+        <w:t xml:space="preserve"> </w:t>
+      </w:r>
+    </w:p>
+    <w:p>
+      <w:pPr>
+        <w:spacing w:line="240" w:lineRule="auto"/>
+        <w:rPr>
+          <w:rFonts w:ascii="Calibri" w:hAnsi="Calibri" w:cs="Calibri"/>
+          <w:sz w:val="24"/>
+          <w:szCs w:val="24"/>
+        </w:rPr>
+      </w:pPr>
+      <w:r>
+        <w:rPr>
+          <w:rFonts w:ascii="Calibri" w:hAnsi="Calibri" w:cs="Calibri"/>
+          <w:b/>
+          <w:sz w:val="24"/>
+          <w:szCs w:val="24"/>
+        </w:rPr>
+        <w:t>Project</w:t>
+      </w:r>
+      <w:r>
+        <w:rPr>
+          <w:rFonts w:ascii="Calibri" w:hAnsi="Calibri" w:cs="Calibri"/>
+          <w:sz w:val="24"/>
+          <w:szCs w:val="24"/>
+        </w:rPr>
+        <w:t>: WINA</w:t>
+      </w:r>
+      <w:r>
+        <w:rPr>
+          <w:rFonts w:ascii="Calibri" w:hAnsi="Calibri" w:cs="Calibri"/>
+          <w:sz w:val="24"/>
+          <w:szCs w:val="24"/>
+        </w:rPr>
+        <w:t xml:space="preserve"> </w:t>
+      </w:r>
+      <w:r>
+        <w:rPr>
+          <w:rFonts w:ascii="Calibri" w:hAnsi="Calibri" w:cs="Calibri"/>
+          <w:sz w:val="24"/>
+          <w:szCs w:val="24"/>
+        </w:rPr>
+        <w:t>System</w:t>
+      </w:r>
+      <w:r>
+        <w:rPr>
+          <w:rFonts w:ascii="Calibri" w:hAnsi="Calibri" w:cs="Calibri"/>
+          <w:sz w:val="24"/>
+          <w:szCs w:val="24"/>
+        </w:rPr>
+        <w:t xml:space="preserve"> (4 members, 2 front-end, 2 back-end)</w:t>
+      </w:r>
+      <w:r>
+        <w:rPr>
+          <w:rFonts w:ascii="Calibri" w:hAnsi="Calibri" w:cs="Calibri"/>
+          <w:sz w:val="24"/>
+          <w:szCs w:val="24"/>
+        </w:rPr>
+        <w:t xml:space="preserve">                    </w:t>
+      </w:r>
+      <w:r>
+        <w:rPr>
+          <w:rStyle w:val="Hyperlink"/>
+          <w:color w:val="5B9BD5" w:themeColor="accent1"/>
+          <w:sz w:val="30"/>
+          <w:szCs w:val="30"/>
+          <w:u w:val="none"/>
+        </w:rPr>
+        <w:t xml:space="preserve">      </w:t>
+      </w:r>
+      <w:r>
+        <w:rPr>
+          <w:rFonts w:ascii="Calibri" w:hAnsi="Calibri" w:cs="Calibri"/>
+          <w:sz w:val="24"/>
+          <w:szCs w:val="24"/>
+        </w:rPr>
+        <w:t xml:space="preserve">      </w:t>
       </w:r>
     </w:p>
     <w:p>
@@ -480,11 +1049,27 @@
       <w:r>
         <w:rPr>
           <w:rFonts w:ascii="Calibri" w:hAnsi="Calibri" w:cs="Calibri"/>
-          <w:bCs/>
-          <w:sz w:val="24"/>
-          <w:szCs w:val="24"/>
-        </w:rPr>
-        <w:t>Good understanding of OOP methodologies, SOLID principles, and design patterns</w:t>
+          <w:b/>
+          <w:sz w:val="24"/>
+          <w:szCs w:val="24"/>
+        </w:rPr>
+        <w:t xml:space="preserve">Description: </w:t>
+      </w:r>
+      <w:r>
+        <w:rPr>
+          <w:rFonts w:ascii="Calibri" w:hAnsi="Calibri" w:cs="Calibri"/>
+          <w:sz w:val="24"/>
+          <w:szCs w:val="24"/>
+        </w:rPr>
+        <w:t xml:space="preserve">An enterprise system </w:t>
+      </w:r>
+      <w:r>
+        <w:rPr>
+          <w:rFonts w:ascii="Calibri" w:hAnsi="Calibri" w:cs="Calibri"/>
+          <w:sz w:val="24"/>
+          <w:szCs w:val="24"/>
+        </w:rPr>
+        <w:t>as a metadata-driven platforms featuring granular RBAC, high-performance data grids, and internationalization.</w:t>
       </w:r>
     </w:p>
     <w:p>
@@ -505,11 +1090,126 @@
       <w:r>
         <w:rPr>
           <w:rFonts w:ascii="Calibri" w:hAnsi="Calibri" w:cs="Calibri"/>
-          <w:bCs/>
-          <w:sz w:val="24"/>
-          <w:szCs w:val="24"/>
-        </w:rPr>
-        <w:t>Experience in Unit &amp; Integration Testing (JUnit 5, Mockito)</w:t>
+          <w:b/>
+          <w:sz w:val="24"/>
+          <w:szCs w:val="24"/>
+        </w:rPr>
+        <w:t>Technologies:</w:t>
+      </w:r>
+    </w:p>
+    <w:p>
+      <w:pPr>
+        <w:pStyle w:val="ListParagraph"/>
+        <w:numPr>
+          <w:ilvl w:val="0"/>
+          <w:numId w:val="2"/>
+        </w:numPr>
+        <w:spacing w:line="240" w:lineRule="auto"/>
+        <w:rPr>
+          <w:rFonts w:ascii="Calibri" w:hAnsi="Calibri" w:cs="Calibri"/>
+          <w:b/>
+          <w:sz w:val="24"/>
+          <w:szCs w:val="24"/>
+        </w:rPr>
+      </w:pPr>
+      <w:r>
+        <w:rPr>
+          <w:rFonts w:ascii="Calibri" w:hAnsi="Calibri" w:cs="Calibri"/>
+          <w:bCs/>
+          <w:sz w:val="24"/>
+          <w:szCs w:val="24"/>
+        </w:rPr>
+        <w:t>Front-end: React</w:t>
+      </w:r>
+      <w:r>
+        <w:rPr>
+          <w:rFonts w:ascii="Calibri" w:hAnsi="Calibri" w:cs="Calibri"/>
+          <w:bCs/>
+          <w:sz w:val="24"/>
+          <w:szCs w:val="24"/>
+        </w:rPr>
+        <w:t xml:space="preserve">, </w:t>
+      </w:r>
+      <w:r>
+        <w:rPr>
+          <w:rFonts w:ascii="Calibri" w:hAnsi="Calibri" w:cs="Calibri"/>
+          <w:bCs/>
+          <w:sz w:val="24"/>
+          <w:szCs w:val="24"/>
+        </w:rPr>
+        <w:t>TypeScript</w:t>
+      </w:r>
+      <w:r>
+        <w:rPr>
+          <w:rFonts w:ascii="Calibri" w:hAnsi="Calibri" w:cs="Calibri"/>
+          <w:bCs/>
+          <w:sz w:val="24"/>
+          <w:szCs w:val="24"/>
+        </w:rPr>
+        <w:t xml:space="preserve">, </w:t>
+      </w:r>
+      <w:proofErr w:type="spellStart"/>
+      <w:r>
+        <w:rPr>
+          <w:rFonts w:ascii="Calibri" w:hAnsi="Calibri" w:cs="Calibri"/>
+          <w:bCs/>
+          <w:sz w:val="24"/>
+          <w:szCs w:val="24"/>
+        </w:rPr>
+        <w:t>MaterialUI</w:t>
+      </w:r>
+      <w:proofErr w:type="spellEnd"/>
+      <w:r>
+        <w:rPr>
+          <w:rFonts w:ascii="Calibri" w:hAnsi="Calibri" w:cs="Calibri"/>
+          <w:bCs/>
+          <w:sz w:val="24"/>
+          <w:szCs w:val="24"/>
+        </w:rPr>
+        <w:t>, AG Grid</w:t>
+      </w:r>
+    </w:p>
+    <w:p>
+      <w:pPr>
+        <w:pStyle w:val="ListParagraph"/>
+        <w:numPr>
+          <w:ilvl w:val="0"/>
+          <w:numId w:val="2"/>
+        </w:numPr>
+        <w:spacing w:line="240" w:lineRule="auto"/>
+        <w:rPr>
+          <w:rFonts w:ascii="Calibri" w:hAnsi="Calibri" w:cs="Calibri"/>
+          <w:b/>
+          <w:sz w:val="24"/>
+          <w:szCs w:val="24"/>
+        </w:rPr>
+      </w:pPr>
+      <w:r>
+        <w:rPr>
+          <w:rFonts w:ascii="Calibri" w:hAnsi="Calibri" w:cs="Calibri"/>
+          <w:bCs/>
+          <w:sz w:val="24"/>
+          <w:szCs w:val="24"/>
+        </w:rPr>
+        <w:t xml:space="preserve">Back-end: Spring Boot, </w:t>
+      </w:r>
+      <w:r>
+        <w:rPr>
+          <w:rFonts w:ascii="Calibri" w:hAnsi="Calibri" w:cs="Calibri"/>
+          <w:bCs/>
+          <w:sz w:val="24"/>
+          <w:szCs w:val="24"/>
+        </w:rPr>
+        <w:t xml:space="preserve">JWT, Ehcache, </w:t>
+      </w:r>
+      <w:r>
+        <w:rPr>
+          <w:rFonts w:ascii="Calibri" w:hAnsi="Calibri" w:cs="Calibri"/>
+          <w:bCs/>
+          <w:sz w:val="24"/>
+          <w:szCs w:val="24"/>
+        </w:rPr>
+        <w:t>Oracle DB</w:t>
       </w:r>
     </w:p>
     <w:p>
@@ -530,119 +1230,139 @@
       <w:r>
         <w:rPr>
           <w:rFonts w:ascii="Calibri" w:hAnsi="Calibri" w:cs="Calibri"/>
-          <w:bCs/>
-          <w:sz w:val="24"/>
-          <w:szCs w:val="24"/>
-        </w:rPr>
-        <w:t>Agile/Scrum mindset</w:t>
-      </w:r>
-    </w:p>
-    <w:p>
-      <w:pPr>
-        <w:spacing w:line="240" w:lineRule="auto"/>
-        <w:rPr>
-          <w:rFonts w:ascii="Calibri" w:hAnsi="Calibri" w:cs="Calibri"/>
-          <w:b/>
-          <w:sz w:val="30"/>
-          <w:szCs w:val="30"/>
-        </w:rPr>
-      </w:pPr>
-      <w:r>
-        <w:rPr>
-          <w:rFonts w:ascii="Calibri" w:hAnsi="Calibri" w:cs="Calibri"/>
-          <w:b/>
-          <w:sz w:val="30"/>
-          <w:szCs w:val="30"/>
-        </w:rPr>
-        <w:t>PROFESSIONAL EXPERIENCE</w:t>
-      </w:r>
-    </w:p>
-    <w:p>
-      <w:pPr>
-        <w:spacing w:line="240" w:lineRule="auto"/>
-        <w:rPr>
-          <w:rFonts w:ascii="Calibri" w:hAnsi="Calibri" w:cs="Calibri"/>
-          <w:sz w:val="24"/>
-          <w:szCs w:val="24"/>
-        </w:rPr>
-      </w:pPr>
-      <w:r>
-        <w:rPr>
-          <w:rFonts w:ascii="Calibri" w:hAnsi="Calibri" w:cs="Calibri"/>
-          <w:b/>
-          <w:sz w:val="24"/>
-          <w:szCs w:val="24"/>
-        </w:rPr>
-        <w:t>LG CNS Company (Vietnam)</w:t>
-      </w:r>
-      <w:r>
-        <w:rPr>
-          <w:rFonts w:ascii="Calibri" w:hAnsi="Calibri" w:cs="Calibri"/>
-          <w:b/>
-          <w:sz w:val="24"/>
-          <w:szCs w:val="24"/>
-        </w:rPr>
-        <w:t xml:space="preserve"> – Full Stack Developer</w:t>
-      </w:r>
-      <w:r>
-        <w:rPr>
-          <w:rFonts w:ascii="Calibri" w:hAnsi="Calibri" w:cs="Calibri"/>
-          <w:b/>
-          <w:sz w:val="24"/>
-          <w:szCs w:val="24"/>
-        </w:rPr>
-        <w:t xml:space="preserve">       </w:t>
-      </w:r>
-      <w:r>
-        <w:rPr>
-          <w:rFonts w:ascii="Calibri" w:hAnsi="Calibri" w:cs="Calibri"/>
-          <w:sz w:val="24"/>
-          <w:szCs w:val="24"/>
-        </w:rPr>
-        <w:t xml:space="preserve">    </w:t>
-      </w:r>
-      <w:r>
-        <w:rPr>
-          <w:rFonts w:ascii="Calibri" w:hAnsi="Calibri" w:cs="Calibri"/>
-          <w:sz w:val="24"/>
-          <w:szCs w:val="24"/>
-        </w:rPr>
-        <w:tab/>
-        <w:t xml:space="preserve">                   </w:t>
-      </w:r>
-      <w:r>
-        <w:rPr>
-          <w:rFonts w:ascii="Calibri" w:hAnsi="Calibri" w:cs="Calibri"/>
-          <w:sz w:val="24"/>
-          <w:szCs w:val="24"/>
-        </w:rPr>
-        <w:t xml:space="preserve">          </w:t>
-      </w:r>
-      <w:r>
-        <w:rPr>
-          <w:rFonts w:ascii="Calibri" w:hAnsi="Calibri" w:cs="Calibri"/>
-          <w:sz w:val="24"/>
-          <w:szCs w:val="24"/>
-        </w:rPr>
-        <w:t xml:space="preserve">     </w:t>
-      </w:r>
-      <w:r>
-        <w:rPr>
-          <w:rFonts w:ascii="Calibri" w:hAnsi="Calibri" w:cs="Calibri"/>
-          <w:b/>
-          <w:sz w:val="24"/>
-          <w:szCs w:val="24"/>
-        </w:rPr>
-        <w:t>02/2025-Now</w:t>
-      </w:r>
-      <w:r>
-        <w:rPr>
-          <w:rFonts w:ascii="Calibri" w:hAnsi="Calibri" w:cs="Calibri"/>
-          <w:b/>
-          <w:sz w:val="24"/>
-          <w:szCs w:val="24"/>
-        </w:rPr>
-        <w:t xml:space="preserve"> </w:t>
+          <w:b/>
+          <w:sz w:val="24"/>
+          <w:szCs w:val="24"/>
+        </w:rPr>
+        <w:t>Responsibilities:</w:t>
+      </w:r>
+    </w:p>
+    <w:p>
+      <w:pPr>
+        <w:pStyle w:val="ListParagraph"/>
+        <w:numPr>
+          <w:ilvl w:val="1"/>
+          <w:numId w:val="4"/>
+        </w:numPr>
+        <w:spacing w:line="240" w:lineRule="auto"/>
+        <w:rPr>
+          <w:rFonts w:ascii="Calibri" w:hAnsi="Calibri" w:cs="Calibri"/>
+          <w:sz w:val="24"/>
+          <w:szCs w:val="24"/>
+        </w:rPr>
+      </w:pPr>
+      <w:r>
+        <w:rPr>
+          <w:rFonts w:ascii="Calibri" w:hAnsi="Calibri" w:cs="Calibri"/>
+          <w:sz w:val="24"/>
+          <w:szCs w:val="24"/>
+        </w:rPr>
+        <w:t>Collaborate in requirement analysis to design RESTful API and optimize database schemas</w:t>
+      </w:r>
+    </w:p>
+    <w:p>
+      <w:pPr>
+        <w:pStyle w:val="ListParagraph"/>
+        <w:numPr>
+          <w:ilvl w:val="1"/>
+          <w:numId w:val="4"/>
+        </w:numPr>
+        <w:spacing w:line="240" w:lineRule="auto"/>
+        <w:rPr>
+          <w:rFonts w:ascii="Calibri" w:hAnsi="Calibri" w:cs="Calibri"/>
+          <w:sz w:val="24"/>
+          <w:szCs w:val="24"/>
+        </w:rPr>
+      </w:pPr>
+      <w:r>
+        <w:rPr>
+          <w:rFonts w:ascii="Calibri" w:hAnsi="Calibri" w:cs="Calibri"/>
+          <w:sz w:val="24"/>
+          <w:szCs w:val="24"/>
+        </w:rPr>
+        <w:t>Research in-depth code and develop features using Spring Boot and ReactJS</w:t>
+      </w:r>
+    </w:p>
+    <w:p>
+      <w:pPr>
+        <w:pStyle w:val="ListParagraph"/>
+        <w:numPr>
+          <w:ilvl w:val="1"/>
+          <w:numId w:val="4"/>
+        </w:numPr>
+        <w:spacing w:line="240" w:lineRule="auto"/>
+        <w:rPr>
+          <w:rFonts w:ascii="Calibri" w:hAnsi="Calibri" w:cs="Calibri"/>
+          <w:sz w:val="24"/>
+          <w:szCs w:val="24"/>
+        </w:rPr>
+      </w:pPr>
+      <w:r>
+        <w:rPr>
+          <w:rFonts w:ascii="Calibri" w:hAnsi="Calibri" w:cs="Calibri"/>
+          <w:sz w:val="24"/>
+          <w:szCs w:val="24"/>
+        </w:rPr>
+        <w:t>Use Oracle DB to manage and maintain more than 100 tables in the database</w:t>
+      </w:r>
+    </w:p>
+    <w:p>
+      <w:pPr>
+        <w:pStyle w:val="ListParagraph"/>
+        <w:numPr>
+          <w:ilvl w:val="1"/>
+          <w:numId w:val="4"/>
+        </w:numPr>
+        <w:spacing w:line="240" w:lineRule="auto"/>
+        <w:rPr>
+          <w:rFonts w:ascii="Calibri" w:hAnsi="Calibri" w:cs="Calibri"/>
+          <w:sz w:val="24"/>
+          <w:szCs w:val="24"/>
+        </w:rPr>
+      </w:pPr>
+      <w:r>
+        <w:rPr>
+          <w:rFonts w:ascii="Calibri" w:hAnsi="Calibri" w:cs="Calibri"/>
+          <w:sz w:val="24"/>
+          <w:szCs w:val="24"/>
+        </w:rPr>
+        <w:t xml:space="preserve">Optimize data fetching performance using </w:t>
+      </w:r>
+      <w:proofErr w:type="spellStart"/>
+      <w:r>
+        <w:rPr>
+          <w:rFonts w:ascii="Calibri" w:hAnsi="Calibri" w:cs="Calibri"/>
+          <w:sz w:val="24"/>
+          <w:szCs w:val="24"/>
+        </w:rPr>
+        <w:t>MyBatis</w:t>
+      </w:r>
+      <w:proofErr w:type="spellEnd"/>
+      <w:r>
+        <w:rPr>
+          <w:rFonts w:ascii="Calibri" w:hAnsi="Calibri" w:cs="Calibri"/>
+          <w:sz w:val="24"/>
+          <w:szCs w:val="24"/>
+        </w:rPr>
+        <w:t xml:space="preserve"> and </w:t>
+      </w:r>
+      <w:proofErr w:type="spellStart"/>
+      <w:r>
+        <w:rPr>
+          <w:rFonts w:ascii="Calibri" w:hAnsi="Calibri" w:cs="Calibri"/>
+          <w:sz w:val="24"/>
+          <w:szCs w:val="24"/>
+        </w:rPr>
+        <w:t>TanStack</w:t>
+      </w:r>
+      <w:proofErr w:type="spellEnd"/>
+      <w:r>
+        <w:rPr>
+          <w:rFonts w:ascii="Calibri" w:hAnsi="Calibri" w:cs="Calibri"/>
+          <w:sz w:val="24"/>
+          <w:szCs w:val="24"/>
+        </w:rPr>
+        <w:t xml:space="preserve"> Query to enhance user experience</w:t>
       </w:r>
     </w:p>
     <w:p>
@@ -669,39 +1389,7 @@
           <w:sz w:val="24"/>
           <w:szCs w:val="24"/>
         </w:rPr>
-        <w:t>: WINA</w:t>
-      </w:r>
-      <w:r>
-        <w:rPr>
-          <w:rFonts w:ascii="Calibri" w:hAnsi="Calibri" w:cs="Calibri"/>
-          <w:sz w:val="24"/>
-          <w:szCs w:val="24"/>
-        </w:rPr>
-        <w:t xml:space="preserve"> </w:t>
-      </w:r>
-      <w:r>
-        <w:rPr>
-          <w:rFonts w:ascii="Calibri" w:hAnsi="Calibri" w:cs="Calibri"/>
-          <w:sz w:val="24"/>
-          <w:szCs w:val="24"/>
-        </w:rPr>
-        <w:t>System</w:t>
-      </w:r>
-      <w:r>
-        <w:rPr>
-          <w:rFonts w:ascii="Calibri" w:hAnsi="Calibri" w:cs="Calibri"/>
-          <w:sz w:val="24"/>
-          <w:szCs w:val="24"/>
-        </w:rPr>
-        <w:t xml:space="preserve"> (4 members, 2 front-end, 2 back-end)</w:t>
-      </w:r>
-      <w:r>
-        <w:rPr>
-          <w:rFonts w:ascii="Calibri" w:hAnsi="Calibri" w:cs="Calibri"/>
-          <w:sz w:val="24"/>
-          <w:szCs w:val="24"/>
-        </w:rPr>
-        <w:t xml:space="preserve">                    </w:t>
+        <w:t xml:space="preserve">: Seat Booking App (4 members, 2 front-end, 2 back-end)                    </w:t>
       </w:r>
       <w:r>
         <w:rPr>
@@ -752,15 +1440,15 @@
           <w:sz w:val="24"/>
           <w:szCs w:val="24"/>
         </w:rPr>
-        <w:t xml:space="preserve">An enterprise system </w:t>
-      </w:r>
-      <w:r>
-        <w:rPr>
-          <w:rFonts w:ascii="Calibri" w:hAnsi="Calibri" w:cs="Calibri"/>
-          <w:sz w:val="24"/>
-          <w:szCs w:val="24"/>
-        </w:rPr>
-        <w:t>as a metadata-driven platforms featuring granular RBAC, high-performance data grids, and internationalization.</w:t>
+        <w:t xml:space="preserve">A seat booking web app </w:t>
+      </w:r>
+      <w:r>
+        <w:rPr>
+          <w:rFonts w:ascii="Calibri" w:hAnsi="Calibri" w:cs="Calibri"/>
+          <w:sz w:val="24"/>
+          <w:szCs w:val="24"/>
+        </w:rPr>
+        <w:t>to create and manage seat reservations</w:t>
       </w:r>
     </w:p>
     <w:p>
@@ -810,8 +1498,19 @@
           <w:sz w:val="24"/>
           <w:szCs w:val="24"/>
         </w:rPr>
-        <w:t>Front-end: React</w:t>
-      </w:r>
+        <w:t xml:space="preserve">Front-end: </w:t>
+      </w:r>
+      <w:proofErr w:type="spellStart"/>
+      <w:r>
+        <w:rPr>
+          <w:rFonts w:ascii="Calibri" w:hAnsi="Calibri" w:cs="Calibri"/>
+          <w:bCs/>
+          <w:sz w:val="24"/>
+          <w:szCs w:val="24"/>
+        </w:rPr>
+        <w:t>VueJS</w:t>
+      </w:r>
+      <w:proofErr w:type="spellEnd"/>
       <w:r>
         <w:rPr>
           <w:rFonts w:ascii="Calibri" w:hAnsi="Calibri" w:cs="Calibri"/>
@@ -821,24 +1520,6 @@
         </w:rPr>
         <w:t xml:space="preserve">, </w:t>
       </w:r>
-      <w:r>
-        <w:rPr>
-          <w:rFonts w:ascii="Calibri" w:hAnsi="Calibri" w:cs="Calibri"/>
-          <w:bCs/>
-          <w:sz w:val="24"/>
-          <w:szCs w:val="24"/>
-        </w:rPr>
-        <w:t>TypeScript</w:t>
-      </w:r>
-      <w:r>
-        <w:rPr>
-          <w:rFonts w:ascii="Calibri" w:hAnsi="Calibri" w:cs="Calibri"/>
-          <w:bCs/>
-          <w:sz w:val="24"/>
-          <w:szCs w:val="24"/>
-        </w:rPr>
-        <w:t xml:space="preserve">, </w:t>
-      </w:r>
       <w:proofErr w:type="spellStart"/>
       <w:r>
         <w:rPr>
@@ -847,7 +1528,7 @@
           <w:sz w:val="24"/>
           <w:szCs w:val="24"/>
         </w:rPr>
-        <w:t>MaterialUI</w:t>
+        <w:t>Vuex</w:t>
       </w:r>
       <w:proofErr w:type="spellEnd"/>
       <w:r>
@@ -857,7 +1538,7 @@
           <w:sz w:val="24"/>
           <w:szCs w:val="24"/>
         </w:rPr>
-        <w:t>, AG Grid</w:t>
+        <w:t>, TypeScript</w:t>
       </w:r>
     </w:p>
     <w:p>
@@ -882,25 +1563,44 @@
           <w:sz w:val="24"/>
           <w:szCs w:val="24"/>
         </w:rPr>
-        <w:t xml:space="preserve">Back-end: Spring Boot, </w:t>
-      </w:r>
-      <w:r>
-        <w:rPr>
-          <w:rFonts w:ascii="Calibri" w:hAnsi="Calibri" w:cs="Calibri"/>
-          <w:bCs/>
-          <w:sz w:val="24"/>
-          <w:szCs w:val="24"/>
-        </w:rPr>
-        <w:t xml:space="preserve">JWT, Ehcache, </w:t>
-      </w:r>
-      <w:r>
-        <w:rPr>
-          <w:rFonts w:ascii="Calibri" w:hAnsi="Calibri" w:cs="Calibri"/>
-          <w:bCs/>
-          <w:sz w:val="24"/>
-          <w:szCs w:val="24"/>
-        </w:rPr>
-        <w:t>Oracle DB</w:t>
+        <w:lastRenderedPageBreak/>
+        <w:t xml:space="preserve">Back-end: Spring Boot, JWT, </w:t>
+      </w:r>
+      <w:r>
+        <w:rPr>
+          <w:rFonts w:ascii="Calibri" w:hAnsi="Calibri" w:cs="Calibri"/>
+          <w:bCs/>
+          <w:sz w:val="24"/>
+          <w:szCs w:val="24"/>
+        </w:rPr>
+        <w:t xml:space="preserve">Transaction, WebSocket, </w:t>
+      </w:r>
+      <w:r>
+        <w:rPr>
+          <w:rFonts w:ascii="Calibri" w:hAnsi="Calibri" w:cs="Calibri"/>
+          <w:bCs/>
+          <w:sz w:val="24"/>
+          <w:szCs w:val="24"/>
+        </w:rPr>
+        <w:t>Redis</w:t>
+      </w:r>
+      <w:r>
+        <w:rPr>
+          <w:rFonts w:ascii="Calibri" w:hAnsi="Calibri" w:cs="Calibri"/>
+          <w:bCs/>
+          <w:sz w:val="24"/>
+          <w:szCs w:val="24"/>
+        </w:rPr>
+        <w:t xml:space="preserve">, </w:t>
+      </w:r>
+      <w:r>
+        <w:rPr>
+          <w:rFonts w:ascii="Calibri" w:hAnsi="Calibri" w:cs="Calibri"/>
+          <w:bCs/>
+          <w:sz w:val="24"/>
+          <w:szCs w:val="24"/>
+        </w:rPr>
+        <w:t>MySQL, Docker</w:t>
       </w:r>
     </w:p>
     <w:p>
@@ -948,7 +1648,7 @@
           <w:sz w:val="24"/>
           <w:szCs w:val="24"/>
         </w:rPr>
-        <w:t>Collaborate in requirement analysis to design RESTful API and optimize database schemas</w:t>
+        <w:t>Analyze business requirements to design RESTful Api and optimize database schemas</w:t>
       </w:r>
     </w:p>
     <w:p>
@@ -971,7 +1671,7 @@
           <w:sz w:val="24"/>
           <w:szCs w:val="24"/>
         </w:rPr>
-        <w:t>Research in-depth code and develop features using Spring Boot and ReactJS</w:t>
+        <w:t>Develop backend services using Spring Boot, focusing on transaction integrity and efficient seat-locking mechanism</w:t>
       </w:r>
     </w:p>
     <w:p>
@@ -994,7 +1694,7 @@
           <w:sz w:val="24"/>
           <w:szCs w:val="24"/>
         </w:rPr>
-        <w:t>Use Oracle DB to manage and maintain more than 100 tables in the database</w:t>
+        <w:t>Implement secure authentication and authorization layers using JWT and Spring Security</w:t>
       </w:r>
     </w:p>
     <w:p>
@@ -1017,7 +1717,7 @@
           <w:sz w:val="24"/>
           <w:szCs w:val="24"/>
         </w:rPr>
-        <w:t xml:space="preserve">Optimize data fetching performance using </w:t>
+        <w:t xml:space="preserve">Manage and maintain database with more 10 tables in MySQL, utilizing </w:t>
       </w:r>
       <w:proofErr w:type="spellStart"/>
       <w:r>
@@ -1035,25 +1735,125 @@
           <w:sz w:val="24"/>
           <w:szCs w:val="24"/>
         </w:rPr>
-        <w:t xml:space="preserve"> and </w:t>
-      </w:r>
+        <w:t xml:space="preserve"> for query tuning and data mapping</w:t>
+      </w:r>
+    </w:p>
+    <w:p>
+      <w:pPr>
+        <w:spacing w:line="240" w:lineRule="auto"/>
+        <w:rPr>
+          <w:rFonts w:ascii="Calibri" w:hAnsi="Calibri" w:cs="Calibri"/>
+          <w:sz w:val="24"/>
+          <w:szCs w:val="24"/>
+        </w:rPr>
+      </w:pPr>
       <w:proofErr w:type="spellStart"/>
       <w:r>
         <w:rPr>
           <w:rFonts w:ascii="Calibri" w:hAnsi="Calibri" w:cs="Calibri"/>
-          <w:sz w:val="24"/>
-          <w:szCs w:val="24"/>
-        </w:rPr>
-        <w:t>TanStack</w:t>
+          <w:b/>
+          <w:sz w:val="24"/>
+          <w:szCs w:val="24"/>
+        </w:rPr>
+        <w:t>Bitsco</w:t>
       </w:r>
       <w:proofErr w:type="spellEnd"/>
       <w:r>
         <w:rPr>
           <w:rFonts w:ascii="Calibri" w:hAnsi="Calibri" w:cs="Calibri"/>
-          <w:sz w:val="24"/>
-          <w:szCs w:val="24"/>
-        </w:rPr>
-        <w:t xml:space="preserve"> Query to enhance user experience</w:t>
+          <w:b/>
+          <w:sz w:val="24"/>
+          <w:szCs w:val="24"/>
+        </w:rPr>
+        <w:t xml:space="preserve"> Company</w:t>
+      </w:r>
+      <w:r>
+        <w:rPr>
+          <w:rFonts w:ascii="Calibri" w:hAnsi="Calibri" w:cs="Calibri"/>
+          <w:b/>
+          <w:sz w:val="24"/>
+          <w:szCs w:val="24"/>
+        </w:rPr>
+        <w:t xml:space="preserve"> (Vietnam)</w:t>
+      </w:r>
+      <w:r>
+        <w:rPr>
+          <w:rFonts w:ascii="Calibri" w:hAnsi="Calibri" w:cs="Calibri"/>
+          <w:b/>
+          <w:sz w:val="24"/>
+          <w:szCs w:val="24"/>
+        </w:rPr>
+        <w:t xml:space="preserve"> – Full Stack Developer</w:t>
+      </w:r>
+      <w:r>
+        <w:rPr>
+          <w:rFonts w:ascii="Calibri" w:hAnsi="Calibri" w:cs="Calibri"/>
+          <w:sz w:val="24"/>
+          <w:szCs w:val="24"/>
+        </w:rPr>
+        <w:t xml:space="preserve">     </w:t>
+      </w:r>
+      <w:r>
+        <w:rPr>
+          <w:rFonts w:ascii="Calibri" w:hAnsi="Calibri" w:cs="Calibri"/>
+          <w:sz w:val="24"/>
+          <w:szCs w:val="24"/>
+        </w:rPr>
+        <w:tab/>
+        <w:t xml:space="preserve">          </w:t>
+      </w:r>
+      <w:r>
+        <w:rPr>
+          <w:rFonts w:ascii="Calibri" w:hAnsi="Calibri" w:cs="Calibri"/>
+          <w:sz w:val="24"/>
+          <w:szCs w:val="24"/>
+        </w:rPr>
+        <w:t xml:space="preserve">                  </w:t>
+      </w:r>
+      <w:r>
+        <w:rPr>
+          <w:rFonts w:ascii="Calibri" w:hAnsi="Calibri" w:cs="Calibri"/>
+          <w:b/>
+          <w:sz w:val="24"/>
+          <w:szCs w:val="24"/>
+        </w:rPr>
+        <w:t>0</w:t>
+      </w:r>
+      <w:r>
+        <w:rPr>
+          <w:rFonts w:ascii="Calibri" w:hAnsi="Calibri" w:cs="Calibri"/>
+          <w:b/>
+          <w:sz w:val="24"/>
+          <w:szCs w:val="24"/>
+        </w:rPr>
+        <w:t>4</w:t>
+      </w:r>
+      <w:r>
+        <w:rPr>
+          <w:rFonts w:ascii="Calibri" w:hAnsi="Calibri" w:cs="Calibri"/>
+          <w:b/>
+          <w:sz w:val="24"/>
+          <w:szCs w:val="24"/>
+        </w:rPr>
+        <w:t>/2024-</w:t>
+      </w:r>
+      <w:r>
+        <w:rPr>
+          <w:rFonts w:ascii="Calibri" w:hAnsi="Calibri" w:cs="Calibri"/>
+          <w:b/>
+          <w:sz w:val="24"/>
+          <w:szCs w:val="24"/>
+        </w:rPr>
+        <w:t>10</w:t>
+      </w:r>
+      <w:r>
+        <w:rPr>
+          <w:rFonts w:ascii="Calibri" w:hAnsi="Calibri" w:cs="Calibri"/>
+          <w:b/>
+          <w:sz w:val="24"/>
+          <w:szCs w:val="24"/>
+        </w:rPr>
+        <w:t>/2024</w:t>
       </w:r>
     </w:p>
     <w:p>
@@ -1080,7 +1880,57 @@
           <w:sz w:val="24"/>
           <w:szCs w:val="24"/>
         </w:rPr>
-        <w:t xml:space="preserve">: Seat Booking App (4 members, 2 front-end, 2 back-end)                    </w:t>
+        <w:t>: HPU</w:t>
+      </w:r>
+      <w:r>
+        <w:rPr>
+          <w:rFonts w:ascii="Calibri" w:hAnsi="Calibri" w:cs="Calibri"/>
+          <w:sz w:val="24"/>
+          <w:szCs w:val="24"/>
+        </w:rPr>
+        <w:t xml:space="preserve"> </w:t>
+      </w:r>
+      <w:proofErr w:type="gramStart"/>
+      <w:r>
+        <w:rPr>
+          <w:rFonts w:ascii="Calibri" w:hAnsi="Calibri" w:cs="Calibri"/>
+          <w:sz w:val="24"/>
+          <w:szCs w:val="24"/>
+        </w:rPr>
+        <w:t>Website</w:t>
+      </w:r>
+      <w:r>
+        <w:rPr>
+          <w:rFonts w:ascii="Calibri" w:hAnsi="Calibri" w:cs="Calibri"/>
+          <w:sz w:val="24"/>
+          <w:szCs w:val="24"/>
+        </w:rPr>
+        <w:t xml:space="preserve"> </w:t>
+      </w:r>
+      <w:r>
+        <w:rPr>
+          <w:rFonts w:ascii="Calibri" w:hAnsi="Calibri" w:cs="Calibri"/>
+          <w:sz w:val="24"/>
+          <w:szCs w:val="24"/>
+        </w:rPr>
+        <w:t xml:space="preserve"> (</w:t>
+      </w:r>
+      <w:proofErr w:type="gramEnd"/>
+      <w:r>
+        <w:rPr>
+          <w:rFonts w:ascii="Calibri" w:hAnsi="Calibri" w:cs="Calibri"/>
+          <w:sz w:val="24"/>
+          <w:szCs w:val="24"/>
+        </w:rPr>
+        <w:t>4 member, 3 front-end, 1 back-end)</w:t>
+      </w:r>
+      <w:r>
+        <w:rPr>
+          <w:rFonts w:ascii="Calibri" w:hAnsi="Calibri" w:cs="Calibri"/>
+          <w:sz w:val="24"/>
+          <w:szCs w:val="24"/>
+        </w:rPr>
+        <w:t xml:space="preserve">                   </w:t>
       </w:r>
       <w:r>
         <w:rPr>
@@ -1131,15 +1981,125 @@
           <w:sz w:val="24"/>
           <w:szCs w:val="24"/>
         </w:rPr>
-        <w:t xml:space="preserve">A seat booking web app </w:t>
-      </w:r>
-      <w:r>
-        <w:rPr>
-          <w:rFonts w:ascii="Calibri" w:hAnsi="Calibri" w:cs="Calibri"/>
-          <w:sz w:val="24"/>
-          <w:szCs w:val="24"/>
-        </w:rPr>
-        <w:t>to create and manage seat reservations</w:t>
+        <w:t>A web app used by the school library to manage</w:t>
+      </w:r>
+      <w:r>
+        <w:rPr>
+          <w:rFonts w:ascii="Calibri" w:hAnsi="Calibri" w:cs="Calibri"/>
+          <w:sz w:val="24"/>
+          <w:szCs w:val="24"/>
+        </w:rPr>
+        <w:t xml:space="preserve"> books, documents </w:t>
+      </w:r>
+      <w:r>
+        <w:rPr>
+          <w:rFonts w:ascii="Calibri" w:hAnsi="Calibri" w:cs="Calibri"/>
+          <w:b/>
+          <w:sz w:val="24"/>
+          <w:szCs w:val="24"/>
+        </w:rPr>
+        <w:t>Technologies:</w:t>
+      </w:r>
+    </w:p>
+    <w:p>
+      <w:pPr>
+        <w:pStyle w:val="ListParagraph"/>
+        <w:numPr>
+          <w:ilvl w:val="0"/>
+          <w:numId w:val="2"/>
+        </w:numPr>
+        <w:spacing w:line="240" w:lineRule="auto"/>
+        <w:rPr>
+          <w:rFonts w:ascii="Calibri" w:hAnsi="Calibri" w:cs="Calibri"/>
+          <w:b/>
+          <w:sz w:val="24"/>
+          <w:szCs w:val="24"/>
+        </w:rPr>
+      </w:pPr>
+      <w:r>
+        <w:rPr>
+          <w:rFonts w:ascii="Calibri" w:hAnsi="Calibri" w:cs="Calibri"/>
+          <w:bCs/>
+          <w:sz w:val="24"/>
+          <w:szCs w:val="24"/>
+        </w:rPr>
+        <w:t>Back-end</w:t>
+      </w:r>
+      <w:r>
+        <w:rPr>
+          <w:rFonts w:ascii="Calibri" w:hAnsi="Calibri" w:cs="Calibri"/>
+          <w:b/>
+          <w:sz w:val="24"/>
+          <w:szCs w:val="24"/>
+        </w:rPr>
+        <w:t xml:space="preserve">: </w:t>
+      </w:r>
+      <w:r>
+        <w:rPr>
+          <w:rFonts w:ascii="Calibri" w:hAnsi="Calibri" w:cs="Calibri"/>
+          <w:sz w:val="24"/>
+          <w:szCs w:val="24"/>
+        </w:rPr>
+        <w:t xml:space="preserve">Spring Boot, </w:t>
+      </w:r>
+      <w:r>
+        <w:rPr>
+          <w:rFonts w:ascii="Calibri" w:hAnsi="Calibri" w:cs="Calibri"/>
+          <w:sz w:val="24"/>
+          <w:szCs w:val="24"/>
+        </w:rPr>
+        <w:t xml:space="preserve">Spring Security, </w:t>
+      </w:r>
+      <w:r>
+        <w:rPr>
+          <w:rFonts w:ascii="Calibri" w:hAnsi="Calibri" w:cs="Calibri"/>
+          <w:sz w:val="24"/>
+          <w:szCs w:val="24"/>
+        </w:rPr>
+        <w:t>JPA</w:t>
+      </w:r>
+    </w:p>
+    <w:p>
+      <w:pPr>
+        <w:pStyle w:val="ListParagraph"/>
+        <w:numPr>
+          <w:ilvl w:val="0"/>
+          <w:numId w:val="2"/>
+        </w:numPr>
+        <w:spacing w:line="240" w:lineRule="auto"/>
+        <w:rPr>
+          <w:rFonts w:ascii="Calibri" w:hAnsi="Calibri" w:cs="Calibri"/>
+          <w:b/>
+          <w:sz w:val="24"/>
+          <w:szCs w:val="24"/>
+        </w:rPr>
+      </w:pPr>
+      <w:r>
+        <w:rPr>
+          <w:rFonts w:ascii="Calibri" w:hAnsi="Calibri" w:cs="Calibri"/>
+          <w:bCs/>
+          <w:sz w:val="24"/>
+          <w:szCs w:val="24"/>
+        </w:rPr>
+        <w:t>Front-end</w:t>
+      </w:r>
+      <w:r>
+        <w:rPr>
+          <w:rFonts w:ascii="Calibri" w:hAnsi="Calibri" w:cs="Calibri"/>
+          <w:b/>
+          <w:sz w:val="24"/>
+          <w:szCs w:val="24"/>
+        </w:rPr>
+        <w:t>:</w:t>
+      </w:r>
+      <w:r>
+        <w:rPr>
+          <w:rFonts w:ascii="Calibri" w:hAnsi="Calibri" w:cs="Calibri"/>
+          <w:bCs/>
+          <w:sz w:val="24"/>
+          <w:szCs w:val="24"/>
+        </w:rPr>
+        <w:t xml:space="preserve"> HTML5, CSS3, Bootstrap, jQuery</w:t>
       </w:r>
     </w:p>
     <w:p>
@@ -1164,157 +2124,6 @@
           <w:sz w:val="24"/>
           <w:szCs w:val="24"/>
         </w:rPr>
-        <w:t>Technologies:</w:t>
-      </w:r>
-    </w:p>
-    <w:p>
-      <w:pPr>
-        <w:pStyle w:val="ListParagraph"/>
-        <w:numPr>
-          <w:ilvl w:val="0"/>
-          <w:numId w:val="2"/>
-        </w:numPr>
-        <w:spacing w:line="240" w:lineRule="auto"/>
-        <w:rPr>
-          <w:rFonts w:ascii="Calibri" w:hAnsi="Calibri" w:cs="Calibri"/>
-          <w:b/>
-          <w:sz w:val="24"/>
-          <w:szCs w:val="24"/>
-        </w:rPr>
-      </w:pPr>
-      <w:r>
-        <w:rPr>
-          <w:rFonts w:ascii="Calibri" w:hAnsi="Calibri" w:cs="Calibri"/>
-          <w:bCs/>
-          <w:sz w:val="24"/>
-          <w:szCs w:val="24"/>
-        </w:rPr>
-        <w:t xml:space="preserve">Front-end: </w:t>
-      </w:r>
-      <w:proofErr w:type="spellStart"/>
-      <w:r>
-        <w:rPr>
-          <w:rFonts w:ascii="Calibri" w:hAnsi="Calibri" w:cs="Calibri"/>
-          <w:bCs/>
-          <w:sz w:val="24"/>
-          <w:szCs w:val="24"/>
-        </w:rPr>
-        <w:t>VueJS</w:t>
-      </w:r>
-      <w:proofErr w:type="spellEnd"/>
-      <w:r>
-        <w:rPr>
-          <w:rFonts w:ascii="Calibri" w:hAnsi="Calibri" w:cs="Calibri"/>
-          <w:bCs/>
-          <w:sz w:val="24"/>
-          <w:szCs w:val="24"/>
-        </w:rPr>
-        <w:t xml:space="preserve">, </w:t>
-      </w:r>
-      <w:proofErr w:type="spellStart"/>
-      <w:r>
-        <w:rPr>
-          <w:rFonts w:ascii="Calibri" w:hAnsi="Calibri" w:cs="Calibri"/>
-          <w:bCs/>
-          <w:sz w:val="24"/>
-          <w:szCs w:val="24"/>
-        </w:rPr>
-        <w:t>Vuex</w:t>
-      </w:r>
-      <w:proofErr w:type="spellEnd"/>
-      <w:r>
-        <w:rPr>
-          <w:rFonts w:ascii="Calibri" w:hAnsi="Calibri" w:cs="Calibri"/>
-          <w:bCs/>
-          <w:sz w:val="24"/>
-          <w:szCs w:val="24"/>
-        </w:rPr>
-        <w:t>, TypeScript</w:t>
-      </w:r>
-    </w:p>
-    <w:p>
-      <w:pPr>
-        <w:pStyle w:val="ListParagraph"/>
-        <w:numPr>
-          <w:ilvl w:val="0"/>
-          <w:numId w:val="2"/>
-        </w:numPr>
-        <w:spacing w:line="240" w:lineRule="auto"/>
-        <w:rPr>
-          <w:rFonts w:ascii="Calibri" w:hAnsi="Calibri" w:cs="Calibri"/>
-          <w:b/>
-          <w:sz w:val="24"/>
-          <w:szCs w:val="24"/>
-        </w:rPr>
-      </w:pPr>
-      <w:r>
-        <w:rPr>
-          <w:rFonts w:ascii="Calibri" w:hAnsi="Calibri" w:cs="Calibri"/>
-          <w:bCs/>
-          <w:sz w:val="24"/>
-          <w:szCs w:val="24"/>
-        </w:rPr>
-        <w:t xml:space="preserve">Back-end: Spring Boot, JWT, </w:t>
-      </w:r>
-      <w:r>
-        <w:rPr>
-          <w:rFonts w:ascii="Calibri" w:hAnsi="Calibri" w:cs="Calibri"/>
-          <w:bCs/>
-          <w:sz w:val="24"/>
-          <w:szCs w:val="24"/>
-        </w:rPr>
-        <w:t xml:space="preserve">Transaction, WebSocket, </w:t>
-      </w:r>
-      <w:r>
-        <w:rPr>
-          <w:rFonts w:ascii="Calibri" w:hAnsi="Calibri" w:cs="Calibri"/>
-          <w:bCs/>
-          <w:sz w:val="24"/>
-          <w:szCs w:val="24"/>
-        </w:rPr>
-        <w:t>Redis</w:t>
-      </w:r>
-      <w:r>
-        <w:rPr>
-          <w:rFonts w:ascii="Calibri" w:hAnsi="Calibri" w:cs="Calibri"/>
-          <w:bCs/>
-          <w:sz w:val="24"/>
-          <w:szCs w:val="24"/>
-        </w:rPr>
-        <w:t xml:space="preserve">, </w:t>
-      </w:r>
-      <w:r>
-        <w:rPr>
-          <w:rFonts w:ascii="Calibri" w:hAnsi="Calibri" w:cs="Calibri"/>
-          <w:bCs/>
-          <w:sz w:val="24"/>
-          <w:szCs w:val="24"/>
-        </w:rPr>
-        <w:t>MySQL, Docker</w:t>
-      </w:r>
-    </w:p>
-    <w:p>
-      <w:pPr>
-        <w:pStyle w:val="ListParagraph"/>
-        <w:numPr>
-          <w:ilvl w:val="0"/>
-          <w:numId w:val="1"/>
-        </w:numPr>
-        <w:spacing w:line="240" w:lineRule="auto"/>
-        <w:rPr>
-          <w:rFonts w:ascii="Calibri" w:hAnsi="Calibri" w:cs="Calibri"/>
-          <w:b/>
-          <w:sz w:val="24"/>
-          <w:szCs w:val="24"/>
-        </w:rPr>
-      </w:pPr>
-      <w:r>
-        <w:rPr>
-          <w:rFonts w:ascii="Calibri" w:hAnsi="Calibri" w:cs="Calibri"/>
-          <w:b/>
-          <w:sz w:val="24"/>
-          <w:szCs w:val="24"/>
-        </w:rPr>
         <w:t>Responsibilities:</w:t>
       </w:r>
     </w:p>
@@ -1338,7 +2147,7 @@
           <w:sz w:val="24"/>
           <w:szCs w:val="24"/>
         </w:rPr>
-        <w:t>Analyze business requirements to design RESTful Api and optimize database schemas</w:t>
+        <w:t>Design UX/UI and implement functionalities (both back-end and front-end) based on the requirements of stakeholders</w:t>
       </w:r>
     </w:p>
     <w:p>
@@ -1361,8 +2170,15 @@
           <w:sz w:val="24"/>
           <w:szCs w:val="24"/>
         </w:rPr>
-        <w:lastRenderedPageBreak/>
-        <w:t>Develop backend services using Spring Boot, focusing on transaction integrity and efficient seat-locking mechanism</w:t>
+        <w:t xml:space="preserve">Design database schema, use </w:t>
+      </w:r>
+      <w:r>
+        <w:rPr>
+          <w:rFonts w:ascii="Calibri" w:hAnsi="Calibri" w:cs="Calibri"/>
+          <w:sz w:val="24"/>
+          <w:szCs w:val="24"/>
+        </w:rPr>
+        <w:t>MySQL to manage and maintain more than 20 tables in the database</w:t>
       </w:r>
     </w:p>
     <w:p>
@@ -1385,495 +2201,6 @@
           <w:sz w:val="24"/>
           <w:szCs w:val="24"/>
         </w:rPr>
-        <w:t>Implement secure authentication and authorization layers using JWT and Spring Security</w:t>
-      </w:r>
-    </w:p>
-    <w:p>
-      <w:pPr>
-        <w:pStyle w:val="ListParagraph"/>
-        <w:numPr>
-          <w:ilvl w:val="1"/>
-          <w:numId w:val="4"/>
-        </w:numPr>
-        <w:spacing w:line="240" w:lineRule="auto"/>
-        <w:rPr>
-          <w:rFonts w:ascii="Calibri" w:hAnsi="Calibri" w:cs="Calibri"/>
-          <w:sz w:val="24"/>
-          <w:szCs w:val="24"/>
-        </w:rPr>
-      </w:pPr>
-      <w:r>
-        <w:rPr>
-          <w:rFonts w:ascii="Calibri" w:hAnsi="Calibri" w:cs="Calibri"/>
-          <w:sz w:val="24"/>
-          <w:szCs w:val="24"/>
-        </w:rPr>
-        <w:t xml:space="preserve">Manage and maintain database with more 10 tables in MySQL, utilizing </w:t>
-      </w:r>
-      <w:proofErr w:type="spellStart"/>
-      <w:r>
-        <w:rPr>
-          <w:rFonts w:ascii="Calibri" w:hAnsi="Calibri" w:cs="Calibri"/>
-          <w:sz w:val="24"/>
-          <w:szCs w:val="24"/>
-        </w:rPr>
-        <w:t>MyBatis</w:t>
-      </w:r>
-      <w:proofErr w:type="spellEnd"/>
-      <w:r>
-        <w:rPr>
-          <w:rFonts w:ascii="Calibri" w:hAnsi="Calibri" w:cs="Calibri"/>
-          <w:sz w:val="24"/>
-          <w:szCs w:val="24"/>
-        </w:rPr>
-        <w:t xml:space="preserve"> for query tuning and data mapping</w:t>
-      </w:r>
-    </w:p>
-    <w:p>
-      <w:pPr>
-        <w:spacing w:line="240" w:lineRule="auto"/>
-        <w:rPr>
-          <w:rFonts w:ascii="Calibri" w:hAnsi="Calibri" w:cs="Calibri"/>
-          <w:sz w:val="24"/>
-          <w:szCs w:val="24"/>
-        </w:rPr>
-      </w:pPr>
-      <w:proofErr w:type="spellStart"/>
-      <w:r>
-        <w:rPr>
-          <w:rFonts w:ascii="Calibri" w:hAnsi="Calibri" w:cs="Calibri"/>
-          <w:b/>
-          <w:sz w:val="24"/>
-          <w:szCs w:val="24"/>
-        </w:rPr>
-        <w:t>Bitsco</w:t>
-      </w:r>
-      <w:proofErr w:type="spellEnd"/>
-      <w:r>
-        <w:rPr>
-          <w:rFonts w:ascii="Calibri" w:hAnsi="Calibri" w:cs="Calibri"/>
-          <w:b/>
-          <w:sz w:val="24"/>
-          <w:szCs w:val="24"/>
-        </w:rPr>
-        <w:t xml:space="preserve"> Company</w:t>
-      </w:r>
-      <w:r>
-        <w:rPr>
-          <w:rFonts w:ascii="Calibri" w:hAnsi="Calibri" w:cs="Calibri"/>
-          <w:b/>
-          <w:sz w:val="24"/>
-          <w:szCs w:val="24"/>
-        </w:rPr>
-        <w:t xml:space="preserve"> (Vietnam)</w:t>
-      </w:r>
-      <w:r>
-        <w:rPr>
-          <w:rFonts w:ascii="Calibri" w:hAnsi="Calibri" w:cs="Calibri"/>
-          <w:b/>
-          <w:sz w:val="24"/>
-          <w:szCs w:val="24"/>
-        </w:rPr>
-        <w:t xml:space="preserve"> – Full Stack Developer</w:t>
-      </w:r>
-      <w:r>
-        <w:rPr>
-          <w:rFonts w:ascii="Calibri" w:hAnsi="Calibri" w:cs="Calibri"/>
-          <w:sz w:val="24"/>
-          <w:szCs w:val="24"/>
-        </w:rPr>
-        <w:t xml:space="preserve">     </w:t>
-      </w:r>
-      <w:r>
-        <w:rPr>
-          <w:rFonts w:ascii="Calibri" w:hAnsi="Calibri" w:cs="Calibri"/>
-          <w:sz w:val="24"/>
-          <w:szCs w:val="24"/>
-        </w:rPr>
-        <w:tab/>
-        <w:t xml:space="preserve">          </w:t>
-      </w:r>
-      <w:r>
-        <w:rPr>
-          <w:rFonts w:ascii="Calibri" w:hAnsi="Calibri" w:cs="Calibri"/>
-          <w:sz w:val="24"/>
-          <w:szCs w:val="24"/>
-        </w:rPr>
-        <w:t xml:space="preserve">                  </w:t>
-      </w:r>
-      <w:r>
-        <w:rPr>
-          <w:rFonts w:ascii="Calibri" w:hAnsi="Calibri" w:cs="Calibri"/>
-          <w:b/>
-          <w:sz w:val="24"/>
-          <w:szCs w:val="24"/>
-        </w:rPr>
-        <w:t>0</w:t>
-      </w:r>
-      <w:r>
-        <w:rPr>
-          <w:rFonts w:ascii="Calibri" w:hAnsi="Calibri" w:cs="Calibri"/>
-          <w:b/>
-          <w:sz w:val="24"/>
-          <w:szCs w:val="24"/>
-        </w:rPr>
-        <w:t>4</w:t>
-      </w:r>
-      <w:r>
-        <w:rPr>
-          <w:rFonts w:ascii="Calibri" w:hAnsi="Calibri" w:cs="Calibri"/>
-          <w:b/>
-          <w:sz w:val="24"/>
-          <w:szCs w:val="24"/>
-        </w:rPr>
-        <w:t>/2024-</w:t>
-      </w:r>
-      <w:r>
-        <w:rPr>
-          <w:rFonts w:ascii="Calibri" w:hAnsi="Calibri" w:cs="Calibri"/>
-          <w:b/>
-          <w:sz w:val="24"/>
-          <w:szCs w:val="24"/>
-        </w:rPr>
-        <w:t>10</w:t>
-      </w:r>
-      <w:r>
-        <w:rPr>
-          <w:rFonts w:ascii="Calibri" w:hAnsi="Calibri" w:cs="Calibri"/>
-          <w:b/>
-          <w:sz w:val="24"/>
-          <w:szCs w:val="24"/>
-        </w:rPr>
-        <w:t>/2024</w:t>
-      </w:r>
-    </w:p>
-    <w:p>
-      <w:pPr>
-        <w:spacing w:line="240" w:lineRule="auto"/>
-        <w:rPr>
-          <w:rFonts w:ascii="Calibri" w:hAnsi="Calibri" w:cs="Calibri"/>
-          <w:sz w:val="24"/>
-          <w:szCs w:val="24"/>
-        </w:rPr>
-      </w:pPr>
-      <w:r>
-        <w:rPr>
-          <w:rFonts w:ascii="Calibri" w:hAnsi="Calibri" w:cs="Calibri"/>
-          <w:b/>
-          <w:sz w:val="24"/>
-          <w:szCs w:val="24"/>
-        </w:rPr>
-        <w:t>Project</w:t>
-      </w:r>
-      <w:r>
-        <w:rPr>
-          <w:rFonts w:ascii="Calibri" w:hAnsi="Calibri" w:cs="Calibri"/>
-          <w:sz w:val="24"/>
-          <w:szCs w:val="24"/>
-        </w:rPr>
-        <w:t>: HPU</w:t>
-      </w:r>
-      <w:r>
-        <w:rPr>
-          <w:rFonts w:ascii="Calibri" w:hAnsi="Calibri" w:cs="Calibri"/>
-          <w:sz w:val="24"/>
-          <w:szCs w:val="24"/>
-        </w:rPr>
-        <w:t xml:space="preserve"> Website</w:t>
-      </w:r>
-      <w:r>
-        <w:rPr>
-          <w:rFonts w:ascii="Calibri" w:hAnsi="Calibri" w:cs="Calibri"/>
-          <w:sz w:val="24"/>
-          <w:szCs w:val="24"/>
-        </w:rPr>
-        <w:t xml:space="preserve"> </w:t>
-      </w:r>
-      <w:r>
-        <w:rPr>
-          <w:rFonts w:ascii="Calibri" w:hAnsi="Calibri" w:cs="Calibri"/>
-          <w:sz w:val="24"/>
-          <w:szCs w:val="24"/>
-        </w:rPr>
-        <w:t xml:space="preserve"> (4 member, 3 front-end, 1 back-end)</w:t>
-      </w:r>
-      <w:r>
-        <w:rPr>
-          <w:rFonts w:ascii="Calibri" w:hAnsi="Calibri" w:cs="Calibri"/>
-          <w:sz w:val="24"/>
-          <w:szCs w:val="24"/>
-        </w:rPr>
-        <w:t xml:space="preserve">                   </w:t>
-      </w:r>
-      <w:r>
-        <w:rPr>
-          <w:rStyle w:val="Hyperlink"/>
-          <w:color w:val="5B9BD5" w:themeColor="accent1"/>
-          <w:sz w:val="30"/>
-          <w:szCs w:val="30"/>
-          <w:u w:val="none"/>
-        </w:rPr>
-        <w:t xml:space="preserve">      </w:t>
-      </w:r>
-      <w:r>
-        <w:rPr>
-          <w:rFonts w:ascii="Calibri" w:hAnsi="Calibri" w:cs="Calibri"/>
-          <w:sz w:val="24"/>
-          <w:szCs w:val="24"/>
-        </w:rPr>
-        <w:t xml:space="preserve">      </w:t>
-      </w:r>
-    </w:p>
-    <w:p>
-      <w:pPr>
-        <w:pStyle w:val="ListParagraph"/>
-        <w:numPr>
-          <w:ilvl w:val="0"/>
-          <w:numId w:val="1"/>
-        </w:numPr>
-        <w:spacing w:line="240" w:lineRule="auto"/>
-        <w:rPr>
-          <w:rFonts w:ascii="Calibri" w:hAnsi="Calibri" w:cs="Calibri"/>
-          <w:b/>
-          <w:sz w:val="24"/>
-          <w:szCs w:val="24"/>
-        </w:rPr>
-      </w:pPr>
-      <w:r>
-        <w:rPr>
-          <w:rFonts w:ascii="Calibri" w:hAnsi="Calibri" w:cs="Calibri"/>
-          <w:b/>
-          <w:sz w:val="24"/>
-          <w:szCs w:val="24"/>
-        </w:rPr>
-        <w:t xml:space="preserve">Description: </w:t>
-      </w:r>
-      <w:r>
-        <w:rPr>
-          <w:rFonts w:ascii="Calibri" w:hAnsi="Calibri" w:cs="Calibri"/>
-          <w:sz w:val="24"/>
-          <w:szCs w:val="24"/>
-        </w:rPr>
-        <w:t>A web app used by the school library to manage</w:t>
-      </w:r>
-      <w:r>
-        <w:rPr>
-          <w:rFonts w:ascii="Calibri" w:hAnsi="Calibri" w:cs="Calibri"/>
-          <w:sz w:val="24"/>
-          <w:szCs w:val="24"/>
-        </w:rPr>
-        <w:t xml:space="preserve"> books, documents </w:t>
-      </w:r>
-      <w:r>
-        <w:rPr>
-          <w:rFonts w:ascii="Calibri" w:hAnsi="Calibri" w:cs="Calibri"/>
-          <w:b/>
-          <w:sz w:val="24"/>
-          <w:szCs w:val="24"/>
-        </w:rPr>
-        <w:t>Technologies:</w:t>
-      </w:r>
-    </w:p>
-    <w:p>
-      <w:pPr>
-        <w:pStyle w:val="ListParagraph"/>
-        <w:numPr>
-          <w:ilvl w:val="0"/>
-          <w:numId w:val="2"/>
-        </w:numPr>
-        <w:spacing w:line="240" w:lineRule="auto"/>
-        <w:rPr>
-          <w:rFonts w:ascii="Calibri" w:hAnsi="Calibri" w:cs="Calibri"/>
-          <w:b/>
-          <w:sz w:val="24"/>
-          <w:szCs w:val="24"/>
-        </w:rPr>
-      </w:pPr>
-      <w:r>
-        <w:rPr>
-          <w:rFonts w:ascii="Calibri" w:hAnsi="Calibri" w:cs="Calibri"/>
-          <w:bCs/>
-          <w:sz w:val="24"/>
-          <w:szCs w:val="24"/>
-        </w:rPr>
-        <w:t>Back-end</w:t>
-      </w:r>
-      <w:r>
-        <w:rPr>
-          <w:rFonts w:ascii="Calibri" w:hAnsi="Calibri" w:cs="Calibri"/>
-          <w:b/>
-          <w:sz w:val="24"/>
-          <w:szCs w:val="24"/>
-        </w:rPr>
-        <w:t xml:space="preserve">: </w:t>
-      </w:r>
-      <w:r>
-        <w:rPr>
-          <w:rFonts w:ascii="Calibri" w:hAnsi="Calibri" w:cs="Calibri"/>
-          <w:sz w:val="24"/>
-          <w:szCs w:val="24"/>
-        </w:rPr>
-        <w:t xml:space="preserve">Spring Boot, </w:t>
-      </w:r>
-      <w:r>
-        <w:rPr>
-          <w:rFonts w:ascii="Calibri" w:hAnsi="Calibri" w:cs="Calibri"/>
-          <w:sz w:val="24"/>
-          <w:szCs w:val="24"/>
-        </w:rPr>
-        <w:t xml:space="preserve">Spring Security, </w:t>
-      </w:r>
-      <w:r>
-        <w:rPr>
-          <w:rFonts w:ascii="Calibri" w:hAnsi="Calibri" w:cs="Calibri"/>
-          <w:sz w:val="24"/>
-          <w:szCs w:val="24"/>
-        </w:rPr>
-        <w:t>JPA</w:t>
-      </w:r>
-    </w:p>
-    <w:p>
-      <w:pPr>
-        <w:pStyle w:val="ListParagraph"/>
-        <w:numPr>
-          <w:ilvl w:val="0"/>
-          <w:numId w:val="2"/>
-        </w:numPr>
-        <w:spacing w:line="240" w:lineRule="auto"/>
-        <w:rPr>
-          <w:rFonts w:ascii="Calibri" w:hAnsi="Calibri" w:cs="Calibri"/>
-          <w:b/>
-          <w:sz w:val="24"/>
-          <w:szCs w:val="24"/>
-        </w:rPr>
-      </w:pPr>
-      <w:r>
-        <w:rPr>
-          <w:rFonts w:ascii="Calibri" w:hAnsi="Calibri" w:cs="Calibri"/>
-          <w:bCs/>
-          <w:sz w:val="24"/>
-          <w:szCs w:val="24"/>
-        </w:rPr>
-        <w:t>Front-end</w:t>
-      </w:r>
-      <w:r>
-        <w:rPr>
-          <w:rFonts w:ascii="Calibri" w:hAnsi="Calibri" w:cs="Calibri"/>
-          <w:b/>
-          <w:sz w:val="24"/>
-          <w:szCs w:val="24"/>
-        </w:rPr>
-        <w:t>:</w:t>
-      </w:r>
-      <w:r>
-        <w:rPr>
-          <w:rFonts w:ascii="Calibri" w:hAnsi="Calibri" w:cs="Calibri"/>
-          <w:bCs/>
-          <w:sz w:val="24"/>
-          <w:szCs w:val="24"/>
-        </w:rPr>
-        <w:t xml:space="preserve"> HTML5, CSS3, Bootstrap, jQuery</w:t>
-      </w:r>
-    </w:p>
-    <w:p>
-      <w:pPr>
-        <w:pStyle w:val="ListParagraph"/>
-        <w:numPr>
-          <w:ilvl w:val="0"/>
-          <w:numId w:val="1"/>
-        </w:numPr>
-        <w:spacing w:line="240" w:lineRule="auto"/>
-        <w:rPr>
-          <w:rFonts w:ascii="Calibri" w:hAnsi="Calibri" w:cs="Calibri"/>
-          <w:b/>
-          <w:sz w:val="24"/>
-          <w:szCs w:val="24"/>
-        </w:rPr>
-      </w:pPr>
-      <w:r>
-        <w:rPr>
-          <w:rFonts w:ascii="Calibri" w:hAnsi="Calibri" w:cs="Calibri"/>
-          <w:b/>
-          <w:sz w:val="24"/>
-          <w:szCs w:val="24"/>
-        </w:rPr>
-        <w:t>Responsibilities:</w:t>
-      </w:r>
-    </w:p>
-    <w:p>
-      <w:pPr>
-        <w:pStyle w:val="ListParagraph"/>
-        <w:numPr>
-          <w:ilvl w:val="1"/>
-          <w:numId w:val="4"/>
-        </w:numPr>
-        <w:spacing w:line="240" w:lineRule="auto"/>
-        <w:rPr>
-          <w:rFonts w:ascii="Calibri" w:hAnsi="Calibri" w:cs="Calibri"/>
-          <w:sz w:val="24"/>
-          <w:szCs w:val="24"/>
-        </w:rPr>
-      </w:pPr>
-      <w:r>
-        <w:rPr>
-          <w:rFonts w:ascii="Calibri" w:hAnsi="Calibri" w:cs="Calibri"/>
-          <w:sz w:val="24"/>
-          <w:szCs w:val="24"/>
-        </w:rPr>
-        <w:t>Design UX/UI and implement functionalities (both back-end and front-end) based on the requirements of stakeholders</w:t>
-      </w:r>
-    </w:p>
-    <w:p>
-      <w:pPr>
-        <w:pStyle w:val="ListParagraph"/>
-        <w:numPr>
-          <w:ilvl w:val="1"/>
-          <w:numId w:val="4"/>
-        </w:numPr>
-        <w:spacing w:line="240" w:lineRule="auto"/>
-        <w:rPr>
-          <w:rFonts w:ascii="Calibri" w:hAnsi="Calibri" w:cs="Calibri"/>
-          <w:sz w:val="24"/>
-          <w:szCs w:val="24"/>
-        </w:rPr>
-      </w:pPr>
-      <w:r>
-        <w:rPr>
-          <w:rFonts w:ascii="Calibri" w:hAnsi="Calibri" w:cs="Calibri"/>
-          <w:sz w:val="24"/>
-          <w:szCs w:val="24"/>
-        </w:rPr>
-        <w:t xml:space="preserve">Design database schema, use </w:t>
-      </w:r>
-      <w:r>
-        <w:rPr>
-          <w:rFonts w:ascii="Calibri" w:hAnsi="Calibri" w:cs="Calibri"/>
-          <w:sz w:val="24"/>
-          <w:szCs w:val="24"/>
-        </w:rPr>
-        <w:t>MySQL to manage and maintain more than 20 tables in the database</w:t>
-      </w:r>
-    </w:p>
-    <w:p>
-      <w:pPr>
-        <w:pStyle w:val="ListParagraph"/>
-        <w:numPr>
-          <w:ilvl w:val="1"/>
-          <w:numId w:val="4"/>
-        </w:numPr>
-        <w:spacing w:line="240" w:lineRule="auto"/>
-        <w:rPr>
-          <w:rFonts w:ascii="Calibri" w:hAnsi="Calibri" w:cs="Calibri"/>
-          <w:sz w:val="24"/>
-          <w:szCs w:val="24"/>
-        </w:rPr>
-      </w:pPr>
-      <w:r>
-        <w:rPr>
-          <w:rFonts w:ascii="Calibri" w:hAnsi="Calibri" w:cs="Calibri"/>
-          <w:sz w:val="24"/>
-          <w:szCs w:val="24"/>
-        </w:rPr>
         <w:t>Conduct tests, perform bug fixing, author technical documentation and deploy on production environment</w:t>
       </w:r>
     </w:p>
@@ -1975,11 +2302,20 @@
           <w:color w:val="auto"/>
           <w:u w:val="none"/>
         </w:rPr>
-        <w:t xml:space="preserve">          </w:t>
-      </w:r>
+        <w:t xml:space="preserve">       </w:t>
+      </w:r>
+      <w:proofErr w:type="gramStart"/>
       <w:r>
         <w:rPr>
           <w:rStyle w:val="Hyperlink"/>
+          <w:color w:val="auto"/>
+          <w:u w:val="none"/>
+        </w:rPr>
+        <w:t xml:space="preserve">   </w:t>
+      </w:r>
+      <w:r>
+        <w:rPr>
+          <w:rStyle w:val="Hyperlink"/>
           <w:rFonts w:ascii="Calibri" w:hAnsi="Calibri" w:cs="Calibri"/>
           <w:color w:val="2F5496" w:themeColor="accent5" w:themeShade="BF"/>
           <w:sz w:val="24"/>
@@ -1988,6 +2324,7 @@
         </w:rPr>
         <w:t>(</w:t>
       </w:r>
+      <w:proofErr w:type="gramEnd"/>
       <w:hyperlink r:id="rId11" w:history="1">
         <w:r>
           <w:rPr>

</xml_diff>